<commit_message>
[ai] add bang mua
</commit_message>
<xml_diff>
--- a/ai_tnhn/ai-api-tnhn/doc/Báo cáo mưa ngày {dd}-{mm}-{yyyy} thời điểm {hh}.docx
+++ b/ai_tnhn/ai-api-tnhn/doc/Báo cáo mưa ngày {dd}-{mm}-{yyyy} thời điểm {hh}.docx
@@ -4007,9 +4007,9 @@
       <w:r>
         <w:rPr>
           <w:rFonts w:ascii="Times New Roman" w:hAnsi="Times New Roman" w:cs="Times New Roman"/>
-          <w:sz w:val="26"/>
-          <w:szCs w:val="26"/>
-          <w:highlight w:val="yellow"/>
+          <w:color w:val="000000" w:themeColor="text1"/>
+          <w:sz w:val="26"/>
+          <w:szCs w:val="26"/>
         </w:rPr>
         <w:t>thời</w:t>
       </w:r>
@@ -4017,19 +4017,19 @@
       <w:r>
         <w:rPr>
           <w:rFonts w:ascii="Times New Roman" w:hAnsi="Times New Roman" w:cs="Times New Roman"/>
-          <w:sz w:val="26"/>
-          <w:szCs w:val="26"/>
-          <w:highlight w:val="yellow"/>
-        </w:rPr>
-        <w:t xml:space="preserve"> </w:t>
-      </w:r>
-      <w:proofErr w:type="spellStart"/>
-      <w:r>
-        <w:rPr>
-          <w:rFonts w:ascii="Times New Roman" w:hAnsi="Times New Roman" w:cs="Times New Roman"/>
-          <w:sz w:val="26"/>
-          <w:szCs w:val="26"/>
-          <w:highlight w:val="yellow"/>
+          <w:color w:val="000000" w:themeColor="text1"/>
+          <w:sz w:val="26"/>
+          <w:szCs w:val="26"/>
+        </w:rPr>
+        <w:t xml:space="preserve"> </w:t>
+      </w:r>
+      <w:proofErr w:type="spellStart"/>
+      <w:r>
+        <w:rPr>
+          <w:rFonts w:ascii="Times New Roman" w:hAnsi="Times New Roman" w:cs="Times New Roman"/>
+          <w:color w:val="000000" w:themeColor="text1"/>
+          <w:sz w:val="26"/>
+          <w:szCs w:val="26"/>
         </w:rPr>
         <w:t>điểm</w:t>
       </w:r>
@@ -4037,18 +4037,18 @@
       <w:r>
         <w:rPr>
           <w:rFonts w:ascii="Times New Roman" w:hAnsi="Times New Roman" w:cs="Times New Roman"/>
-          <w:sz w:val="26"/>
-          <w:szCs w:val="26"/>
-          <w:highlight w:val="yellow"/>
-        </w:rPr>
-        <w:t xml:space="preserve"> </w:t>
-      </w:r>
-      <w:r>
-        <w:rPr>
-          <w:rFonts w:ascii="Times New Roman" w:hAnsi="Times New Roman" w:cs="Times New Roman"/>
-          <w:sz w:val="26"/>
-          <w:szCs w:val="26"/>
-          <w:highlight w:val="yellow"/>
+          <w:color w:val="000000" w:themeColor="text1"/>
+          <w:sz w:val="26"/>
+          <w:szCs w:val="26"/>
+        </w:rPr>
+        <w:t xml:space="preserve"> </w:t>
+      </w:r>
+      <w:r>
+        <w:rPr>
+          <w:rFonts w:ascii="Times New Roman" w:hAnsi="Times New Roman" w:cs="Times New Roman"/>
+          <w:color w:val="000000" w:themeColor="text1"/>
+          <w:sz w:val="26"/>
+          <w:szCs w:val="26"/>
         </w:rPr>
         <w:t>{</w:t>
       </w:r>
@@ -4056,9 +4056,9 @@
       <w:r>
         <w:rPr>
           <w:rFonts w:ascii="Times New Roman" w:hAnsi="Times New Roman" w:cs="Times New Roman"/>
-          <w:sz w:val="26"/>
-          <w:szCs w:val="26"/>
-          <w:highlight w:val="yellow"/>
+          <w:color w:val="000000" w:themeColor="text1"/>
+          <w:sz w:val="26"/>
+          <w:szCs w:val="26"/>
         </w:rPr>
         <w:t>hh</w:t>
       </w:r>
@@ -4066,19 +4066,28 @@
       <w:r>
         <w:rPr>
           <w:rFonts w:ascii="Times New Roman" w:hAnsi="Times New Roman" w:cs="Times New Roman"/>
-          <w:sz w:val="26"/>
-          <w:szCs w:val="26"/>
-          <w:highlight w:val="yellow"/>
+          <w:color w:val="000000" w:themeColor="text1"/>
+          <w:sz w:val="26"/>
+          <w:szCs w:val="26"/>
         </w:rPr>
         <w:t>}</w:t>
       </w:r>
       <w:r>
         <w:rPr>
           <w:rFonts w:ascii="Times New Roman" w:hAnsi="Times New Roman" w:cs="Times New Roman"/>
-          <w:sz w:val="26"/>
-          <w:szCs w:val="26"/>
-        </w:rPr>
-        <w:t xml:space="preserve"> (</w:t>
+          <w:color w:val="000000" w:themeColor="text1"/>
+          <w:sz w:val="26"/>
+          <w:szCs w:val="26"/>
+        </w:rPr>
+        <w:t xml:space="preserve"> </w:t>
+      </w:r>
+      <w:r>
+        <w:rPr>
+          <w:rFonts w:ascii="Times New Roman" w:hAnsi="Times New Roman" w:cs="Times New Roman"/>
+          <w:sz w:val="26"/>
+          <w:szCs w:val="26"/>
+        </w:rPr>
+        <w:t>(</w:t>
       </w:r>
       <w:proofErr w:type="spellStart"/>
       <w:r>
@@ -4443,7 +4452,7 @@
         <w:jc w:val="both"/>
         <w:rPr>
           <w:rFonts w:ascii="Times New Roman" w:eastAsia="Times New Roman" w:hAnsi="Times New Roman" w:cs="Times New Roman"/>
-          <w:color w:val="EE0000"/>
+          <w:color w:val="000000" w:themeColor="text1"/>
           <w:sz w:val="26"/>
           <w:szCs w:val="26"/>
           <w:lang w:val="vi-VN"/>
@@ -4452,7 +4461,7 @@
       <w:r>
         <w:rPr>
           <w:rFonts w:ascii="Times New Roman" w:eastAsia="Times New Roman" w:hAnsi="Times New Roman" w:cs="Times New Roman"/>
-          <w:color w:val="EE0000"/>
+          <w:color w:val="000000" w:themeColor="text1"/>
           <w:sz w:val="26"/>
           <w:szCs w:val="26"/>
           <w:lang w:val="vi-VN"/>
@@ -4468,7 +4477,7 @@
         <w:jc w:val="both"/>
         <w:rPr>
           <w:rFonts w:ascii="Times New Roman" w:eastAsia="Times New Roman" w:hAnsi="Times New Roman" w:cs="Times New Roman"/>
-          <w:color w:val="EE0000"/>
+          <w:color w:val="000000" w:themeColor="text1"/>
           <w:sz w:val="26"/>
           <w:szCs w:val="26"/>
           <w:lang w:val="vi-VN"/>
@@ -4478,7 +4487,7 @@
       <w:r>
         <w:rPr>
           <w:rFonts w:ascii="Times New Roman" w:eastAsia="Times New Roman" w:hAnsi="Times New Roman" w:cs="Times New Roman"/>
-          <w:color w:val="EE0000"/>
+          <w:color w:val="000000" w:themeColor="text1"/>
           <w:sz w:val="26"/>
           <w:szCs w:val="26"/>
         </w:rPr>
@@ -4488,17 +4497,17 @@
       <w:r>
         <w:rPr>
           <w:rFonts w:ascii="Times New Roman" w:eastAsia="Times New Roman" w:hAnsi="Times New Roman" w:cs="Times New Roman"/>
-          <w:color w:val="EE0000"/>
-          <w:sz w:val="26"/>
-          <w:szCs w:val="26"/>
-        </w:rPr>
-        <w:t xml:space="preserve"> </w:t>
-      </w:r>
-      <w:proofErr w:type="spellStart"/>
-      <w:r>
-        <w:rPr>
-          <w:rFonts w:ascii="Times New Roman" w:eastAsia="Times New Roman" w:hAnsi="Times New Roman" w:cs="Times New Roman"/>
-          <w:color w:val="EE0000"/>
+          <w:color w:val="000000" w:themeColor="text1"/>
+          <w:sz w:val="26"/>
+          <w:szCs w:val="26"/>
+        </w:rPr>
+        <w:t xml:space="preserve"> </w:t>
+      </w:r>
+      <w:proofErr w:type="spellStart"/>
+      <w:r>
+        <w:rPr>
+          <w:rFonts w:ascii="Times New Roman" w:eastAsia="Times New Roman" w:hAnsi="Times New Roman" w:cs="Times New Roman"/>
+          <w:color w:val="000000" w:themeColor="text1"/>
           <w:sz w:val="26"/>
           <w:szCs w:val="26"/>
         </w:rPr>
@@ -4508,17 +4517,17 @@
       <w:r>
         <w:rPr>
           <w:rFonts w:ascii="Times New Roman" w:eastAsia="Times New Roman" w:hAnsi="Times New Roman" w:cs="Times New Roman"/>
-          <w:color w:val="EE0000"/>
-          <w:sz w:val="26"/>
-          <w:szCs w:val="26"/>
-        </w:rPr>
-        <w:t xml:space="preserve"> </w:t>
-      </w:r>
-      <w:proofErr w:type="spellStart"/>
-      <w:r>
-        <w:rPr>
-          <w:rFonts w:ascii="Times New Roman" w:eastAsia="Times New Roman" w:hAnsi="Times New Roman" w:cs="Times New Roman"/>
-          <w:color w:val="EE0000"/>
+          <w:color w:val="000000" w:themeColor="text1"/>
+          <w:sz w:val="26"/>
+          <w:szCs w:val="26"/>
+        </w:rPr>
+        <w:t xml:space="preserve"> </w:t>
+      </w:r>
+      <w:proofErr w:type="spellStart"/>
+      <w:r>
+        <w:rPr>
+          <w:rFonts w:ascii="Times New Roman" w:eastAsia="Times New Roman" w:hAnsi="Times New Roman" w:cs="Times New Roman"/>
+          <w:color w:val="000000" w:themeColor="text1"/>
           <w:sz w:val="26"/>
           <w:szCs w:val="26"/>
         </w:rPr>
@@ -4528,17 +4537,17 @@
       <w:r>
         <w:rPr>
           <w:rFonts w:ascii="Times New Roman" w:eastAsia="Times New Roman" w:hAnsi="Times New Roman" w:cs="Times New Roman"/>
-          <w:color w:val="EE0000"/>
-          <w:sz w:val="26"/>
-          <w:szCs w:val="26"/>
-        </w:rPr>
-        <w:t xml:space="preserve"> </w:t>
-      </w:r>
-      <w:proofErr w:type="spellStart"/>
-      <w:r>
-        <w:rPr>
-          <w:rFonts w:ascii="Times New Roman" w:eastAsia="Times New Roman" w:hAnsi="Times New Roman" w:cs="Times New Roman"/>
-          <w:color w:val="EE0000"/>
+          <w:color w:val="000000" w:themeColor="text1"/>
+          <w:sz w:val="26"/>
+          <w:szCs w:val="26"/>
+        </w:rPr>
+        <w:t xml:space="preserve"> </w:t>
+      </w:r>
+      <w:proofErr w:type="spellStart"/>
+      <w:r>
+        <w:rPr>
+          <w:rFonts w:ascii="Times New Roman" w:eastAsia="Times New Roman" w:hAnsi="Times New Roman" w:cs="Times New Roman"/>
+          <w:color w:val="000000" w:themeColor="text1"/>
           <w:sz w:val="26"/>
           <w:szCs w:val="26"/>
         </w:rPr>
@@ -4548,17 +4557,17 @@
       <w:r>
         <w:rPr>
           <w:rFonts w:ascii="Times New Roman" w:eastAsia="Times New Roman" w:hAnsi="Times New Roman" w:cs="Times New Roman"/>
-          <w:color w:val="EE0000"/>
-          <w:sz w:val="26"/>
-          <w:szCs w:val="26"/>
-        </w:rPr>
-        <w:t xml:space="preserve"> </w:t>
-      </w:r>
-      <w:proofErr w:type="spellStart"/>
-      <w:r>
-        <w:rPr>
-          <w:rFonts w:ascii="Times New Roman" w:eastAsia="Times New Roman" w:hAnsi="Times New Roman" w:cs="Times New Roman"/>
-          <w:color w:val="EE0000"/>
+          <w:color w:val="000000" w:themeColor="text1"/>
+          <w:sz w:val="26"/>
+          <w:szCs w:val="26"/>
+        </w:rPr>
+        <w:t xml:space="preserve"> </w:t>
+      </w:r>
+      <w:proofErr w:type="spellStart"/>
+      <w:r>
+        <w:rPr>
+          <w:rFonts w:ascii="Times New Roman" w:eastAsia="Times New Roman" w:hAnsi="Times New Roman" w:cs="Times New Roman"/>
+          <w:color w:val="000000" w:themeColor="text1"/>
           <w:sz w:val="26"/>
           <w:szCs w:val="26"/>
         </w:rPr>
@@ -6588,33 +6597,7 @@
           <w:highlight w:val="yellow"/>
           <w:shd w:val="clear" w:color="auto" w:fill="FFFFFF"/>
         </w:rPr>
-        <w:t xml:space="preserve"> </w:t>
-      </w:r>
-      <w:proofErr w:type="spellStart"/>
-      <w:r>
-        <w:rPr>
-          <w:rFonts w:ascii="Times New Roman" w:hAnsi="Times New Roman" w:cs="Times New Roman"/>
-          <w:color w:val="000000" w:themeColor="text1"/>
-          <w:spacing w:val="3"/>
-          <w:sz w:val="26"/>
-          <w:szCs w:val="26"/>
-          <w:highlight w:val="yellow"/>
-          <w:shd w:val="clear" w:color="auto" w:fill="FFFFFF"/>
-        </w:rPr>
-        <w:t>0/20</w:t>
-      </w:r>
-      <w:proofErr w:type="spellEnd"/>
-      <w:r>
-        <w:rPr>
-          <w:rFonts w:ascii="Times New Roman" w:hAnsi="Times New Roman" w:cs="Times New Roman"/>
-          <w:color w:val="000000" w:themeColor="text1"/>
-          <w:spacing w:val="3"/>
-          <w:sz w:val="26"/>
-          <w:szCs w:val="26"/>
-          <w:highlight w:val="yellow"/>
-          <w:shd w:val="clear" w:color="auto" w:fill="FFFFFF"/>
-        </w:rPr>
-        <w:t xml:space="preserve"> </w:t>
+        <w:t xml:space="preserve"> 0/20 </w:t>
       </w:r>
       <w:proofErr w:type="spellStart"/>
       <w:r>

</xml_diff>

<commit_message>
[ai] add time bắt đầu - gần nhất
</commit_message>
<xml_diff>
--- a/ai_tnhn/ai-api-tnhn/doc/Báo cáo mưa ngày {dd}-{mm}-{yyyy} thời điểm {hh}.docx
+++ b/ai_tnhn/ai-api-tnhn/doc/Báo cáo mưa ngày {dd}-{mm}-{yyyy} thời điểm {hh}.docx
@@ -3225,7 +3225,15 @@
           <w:sz w:val="26"/>
           <w:szCs w:val="26"/>
         </w:rPr>
-        <w:t>đông</w:t>
+        <w:t>d</w:t>
+      </w:r>
+      <w:r>
+        <w:rPr>
+          <w:rFonts w:ascii="Times New Roman" w:eastAsia="Times New Roman" w:hAnsi="Times New Roman" w:cs="Times New Roman"/>
+          <w:sz w:val="26"/>
+          <w:szCs w:val="26"/>
+        </w:rPr>
+        <w:t>ông</w:t>
       </w:r>
       <w:proofErr w:type="spellEnd"/>
       <w:r>
@@ -3419,335 +3427,21 @@
       <w:r>
         <w:rPr>
           <w:rFonts w:ascii="Times New Roman" w:eastAsia="Times New Roman" w:hAnsi="Times New Roman" w:cs="Times New Roman"/>
-          <w:sz w:val="26"/>
-          <w:szCs w:val="26"/>
-        </w:rPr>
-        <w:t>{time</w:t>
-      </w:r>
-      <w:r>
-        <w:rPr>
-          <w:rFonts w:ascii="Times New Roman" w:eastAsia="Times New Roman" w:hAnsi="Times New Roman" w:cs="Times New Roman"/>
+          <w:color w:val="000000" w:themeColor="text1"/>
           <w:sz w:val="26"/>
           <w:szCs w:val="26"/>
           <w:lang w:val="vi-VN"/>
         </w:rPr>
-        <w:t>_mua_start}</w:t>
-      </w:r>
-      <w:r>
-        <w:rPr>
-          <w:rFonts w:ascii="Times New Roman" w:eastAsia="Times New Roman" w:hAnsi="Times New Roman" w:cs="Times New Roman"/>
-          <w:color w:val="EE0000"/>
-          <w:sz w:val="26"/>
-          <w:szCs w:val="26"/>
-        </w:rPr>
-        <w:t xml:space="preserve">15h54' </w:t>
-      </w:r>
-      <w:proofErr w:type="spellStart"/>
-      <w:r>
-        <w:rPr>
-          <w:rFonts w:ascii="Times New Roman" w:eastAsia="Times New Roman" w:hAnsi="Times New Roman" w:cs="Times New Roman"/>
-          <w:color w:val="EE0000"/>
-          <w:sz w:val="26"/>
-          <w:szCs w:val="26"/>
-        </w:rPr>
-        <w:t>đến</w:t>
-      </w:r>
-      <w:proofErr w:type="spellEnd"/>
-      <w:r>
-        <w:rPr>
-          <w:rFonts w:ascii="Times New Roman" w:eastAsia="Times New Roman" w:hAnsi="Times New Roman" w:cs="Times New Roman"/>
-          <w:color w:val="EE0000"/>
-          <w:sz w:val="26"/>
-          <w:szCs w:val="26"/>
-        </w:rPr>
-        <w:t xml:space="preserve"> 15h54'</w:t>
-      </w:r>
-      <w:r>
-        <w:rPr>
-          <w:rFonts w:ascii="Times New Roman" w:eastAsia="Times New Roman" w:hAnsi="Times New Roman" w:cs="Times New Roman"/>
-          <w:color w:val="EE0000"/>
-          <w:sz w:val="26"/>
-          <w:szCs w:val="26"/>
-        </w:rPr>
-        <w:t xml:space="preserve"> (</w:t>
-      </w:r>
-      <w:proofErr w:type="spellStart"/>
-      <w:r>
-        <w:rPr>
-          <w:rFonts w:ascii="Times New Roman" w:eastAsia="Times New Roman" w:hAnsi="Times New Roman" w:cs="Times New Roman"/>
-          <w:color w:val="EE0000"/>
-          <w:sz w:val="26"/>
-          <w:szCs w:val="26"/>
-        </w:rPr>
-        <w:t>lấy</w:t>
-      </w:r>
-      <w:proofErr w:type="spellEnd"/>
-      <w:r>
-        <w:rPr>
-          <w:rFonts w:ascii="Times New Roman" w:eastAsia="Times New Roman" w:hAnsi="Times New Roman" w:cs="Times New Roman"/>
-          <w:color w:val="EE0000"/>
-          <w:sz w:val="26"/>
-          <w:szCs w:val="26"/>
-        </w:rPr>
-        <w:t xml:space="preserve"> </w:t>
-      </w:r>
-      <w:proofErr w:type="spellStart"/>
-      <w:r>
-        <w:rPr>
-          <w:rFonts w:ascii="Times New Roman" w:eastAsia="Times New Roman" w:hAnsi="Times New Roman" w:cs="Times New Roman"/>
-          <w:color w:val="EE0000"/>
-          <w:sz w:val="26"/>
-          <w:szCs w:val="26"/>
-        </w:rPr>
-        <w:t>thông</w:t>
-      </w:r>
-      <w:proofErr w:type="spellEnd"/>
-      <w:r>
-        <w:rPr>
-          <w:rFonts w:ascii="Times New Roman" w:eastAsia="Times New Roman" w:hAnsi="Times New Roman" w:cs="Times New Roman"/>
-          <w:color w:val="EE0000"/>
-          <w:sz w:val="26"/>
-          <w:szCs w:val="26"/>
-        </w:rPr>
-        <w:t xml:space="preserve"> tin </w:t>
-      </w:r>
-      <w:proofErr w:type="spellStart"/>
-      <w:r>
-        <w:rPr>
-          <w:rFonts w:ascii="Times New Roman" w:eastAsia="Times New Roman" w:hAnsi="Times New Roman" w:cs="Times New Roman"/>
-          <w:color w:val="EE0000"/>
-          <w:sz w:val="26"/>
-          <w:szCs w:val="26"/>
-        </w:rPr>
-        <w:t>tại</w:t>
-      </w:r>
-      <w:proofErr w:type="spellEnd"/>
-      <w:r>
-        <w:rPr>
-          <w:rFonts w:ascii="Times New Roman" w:eastAsia="Times New Roman" w:hAnsi="Times New Roman" w:cs="Times New Roman"/>
-          <w:color w:val="EE0000"/>
-          <w:sz w:val="26"/>
-          <w:szCs w:val="26"/>
-        </w:rPr>
-        <w:t xml:space="preserve"> </w:t>
-      </w:r>
-      <w:proofErr w:type="spellStart"/>
-      <w:r>
-        <w:rPr>
-          <w:rFonts w:ascii="Times New Roman" w:eastAsia="Times New Roman" w:hAnsi="Times New Roman" w:cs="Times New Roman"/>
-          <w:color w:val="EE0000"/>
-          <w:sz w:val="26"/>
-          <w:szCs w:val="26"/>
-        </w:rPr>
-        <w:t>bảng</w:t>
-      </w:r>
-      <w:proofErr w:type="spellEnd"/>
-      <w:r>
-        <w:rPr>
-          <w:rFonts w:ascii="Times New Roman" w:eastAsia="Times New Roman" w:hAnsi="Times New Roman" w:cs="Times New Roman"/>
-          <w:color w:val="EE0000"/>
-          <w:sz w:val="26"/>
-          <w:szCs w:val="26"/>
-        </w:rPr>
-        <w:t xml:space="preserve"> </w:t>
-      </w:r>
-      <w:proofErr w:type="spellStart"/>
-      <w:r>
-        <w:rPr>
-          <w:rFonts w:ascii="Times New Roman" w:eastAsia="Times New Roman" w:hAnsi="Times New Roman" w:cs="Times New Roman"/>
-          <w:color w:val="EE0000"/>
-          <w:sz w:val="26"/>
-          <w:szCs w:val="26"/>
-        </w:rPr>
-        <w:t>lúc</w:t>
-      </w:r>
-      <w:proofErr w:type="spellEnd"/>
-      <w:r>
-        <w:rPr>
-          <w:rFonts w:ascii="Times New Roman" w:eastAsia="Times New Roman" w:hAnsi="Times New Roman" w:cs="Times New Roman"/>
-          <w:color w:val="EE0000"/>
-          <w:sz w:val="26"/>
-          <w:szCs w:val="26"/>
-        </w:rPr>
-        <w:t xml:space="preserve"> </w:t>
-      </w:r>
-      <w:proofErr w:type="spellStart"/>
-      <w:r>
-        <w:rPr>
-          <w:rFonts w:ascii="Times New Roman" w:eastAsia="Times New Roman" w:hAnsi="Times New Roman" w:cs="Times New Roman"/>
-          <w:color w:val="EE0000"/>
-          <w:sz w:val="26"/>
-          <w:szCs w:val="26"/>
-        </w:rPr>
-        <w:t>thời</w:t>
-      </w:r>
-      <w:proofErr w:type="spellEnd"/>
-      <w:r>
-        <w:rPr>
-          <w:rFonts w:ascii="Times New Roman" w:eastAsia="Times New Roman" w:hAnsi="Times New Roman" w:cs="Times New Roman"/>
-          <w:color w:val="EE0000"/>
-          <w:sz w:val="26"/>
-          <w:szCs w:val="26"/>
-        </w:rPr>
-        <w:t xml:space="preserve"> </w:t>
-      </w:r>
-      <w:proofErr w:type="spellStart"/>
-      <w:r>
-        <w:rPr>
-          <w:rFonts w:ascii="Times New Roman" w:eastAsia="Times New Roman" w:hAnsi="Times New Roman" w:cs="Times New Roman"/>
-          <w:color w:val="EE0000"/>
-          <w:sz w:val="26"/>
-          <w:szCs w:val="26"/>
-        </w:rPr>
-        <w:t>điểm</w:t>
-      </w:r>
-      <w:proofErr w:type="spellEnd"/>
-      <w:r>
-        <w:rPr>
-          <w:rFonts w:ascii="Times New Roman" w:eastAsia="Times New Roman" w:hAnsi="Times New Roman" w:cs="Times New Roman"/>
-          <w:color w:val="EE0000"/>
-          <w:sz w:val="26"/>
-          <w:szCs w:val="26"/>
-        </w:rPr>
-        <w:t xml:space="preserve"> </w:t>
-      </w:r>
-      <w:proofErr w:type="spellStart"/>
-      <w:r>
-        <w:rPr>
-          <w:rFonts w:ascii="Times New Roman" w:eastAsia="Times New Roman" w:hAnsi="Times New Roman" w:cs="Times New Roman"/>
-          <w:color w:val="EE0000"/>
-          <w:sz w:val="26"/>
-          <w:szCs w:val="26"/>
-        </w:rPr>
-        <w:t>mưa</w:t>
-      </w:r>
-      <w:proofErr w:type="spellEnd"/>
-      <w:r>
-        <w:rPr>
-          <w:rFonts w:ascii="Times New Roman" w:eastAsia="Times New Roman" w:hAnsi="Times New Roman" w:cs="Times New Roman"/>
-          <w:color w:val="EE0000"/>
-          <w:sz w:val="26"/>
-          <w:szCs w:val="26"/>
-        </w:rPr>
-        <w:t xml:space="preserve"> </w:t>
-      </w:r>
-      <w:proofErr w:type="spellStart"/>
-      <w:r>
-        <w:rPr>
-          <w:rFonts w:ascii="Times New Roman" w:eastAsia="Times New Roman" w:hAnsi="Times New Roman" w:cs="Times New Roman"/>
-          <w:color w:val="EE0000"/>
-          <w:sz w:val="26"/>
-          <w:szCs w:val="26"/>
-        </w:rPr>
-        <w:t>cho</w:t>
-      </w:r>
-      <w:proofErr w:type="spellEnd"/>
-      <w:r>
-        <w:rPr>
-          <w:rFonts w:ascii="Times New Roman" w:eastAsia="Times New Roman" w:hAnsi="Times New Roman" w:cs="Times New Roman"/>
-          <w:color w:val="EE0000"/>
-          <w:sz w:val="26"/>
-          <w:szCs w:val="26"/>
-        </w:rPr>
-        <w:t xml:space="preserve"> </w:t>
-      </w:r>
-      <w:proofErr w:type="spellStart"/>
-      <w:r>
-        <w:rPr>
-          <w:rFonts w:ascii="Times New Roman" w:eastAsia="Times New Roman" w:hAnsi="Times New Roman" w:cs="Times New Roman"/>
-          <w:color w:val="EE0000"/>
-          <w:sz w:val="26"/>
-          <w:szCs w:val="26"/>
-        </w:rPr>
-        <w:t>đến</w:t>
-      </w:r>
-      <w:proofErr w:type="spellEnd"/>
-      <w:r>
-        <w:rPr>
-          <w:rFonts w:ascii="Times New Roman" w:eastAsia="Times New Roman" w:hAnsi="Times New Roman" w:cs="Times New Roman"/>
-          <w:color w:val="EE0000"/>
-          <w:sz w:val="26"/>
-          <w:szCs w:val="26"/>
-        </w:rPr>
-        <w:t xml:space="preserve"> </w:t>
-      </w:r>
-      <w:proofErr w:type="spellStart"/>
-      <w:r>
-        <w:rPr>
-          <w:rFonts w:ascii="Times New Roman" w:eastAsia="Times New Roman" w:hAnsi="Times New Roman" w:cs="Times New Roman"/>
-          <w:color w:val="EE0000"/>
-          <w:sz w:val="26"/>
-          <w:szCs w:val="26"/>
-        </w:rPr>
-        <w:t>khi</w:t>
-      </w:r>
-      <w:proofErr w:type="spellEnd"/>
-      <w:r>
-        <w:rPr>
-          <w:rFonts w:ascii="Times New Roman" w:eastAsia="Times New Roman" w:hAnsi="Times New Roman" w:cs="Times New Roman"/>
-          <w:color w:val="EE0000"/>
-          <w:sz w:val="26"/>
-          <w:szCs w:val="26"/>
-        </w:rPr>
-        <w:t xml:space="preserve"> </w:t>
-      </w:r>
-      <w:proofErr w:type="spellStart"/>
-      <w:r>
-        <w:rPr>
-          <w:rFonts w:ascii="Times New Roman" w:eastAsia="Times New Roman" w:hAnsi="Times New Roman" w:cs="Times New Roman"/>
-          <w:color w:val="EE0000"/>
-          <w:sz w:val="26"/>
-          <w:szCs w:val="26"/>
-        </w:rPr>
-        <w:t>ngừng</w:t>
-      </w:r>
-      <w:proofErr w:type="spellEnd"/>
-      <w:r>
-        <w:rPr>
-          <w:rFonts w:ascii="Times New Roman" w:eastAsia="Times New Roman" w:hAnsi="Times New Roman" w:cs="Times New Roman"/>
-          <w:color w:val="EE0000"/>
-          <w:sz w:val="26"/>
-          <w:szCs w:val="26"/>
-        </w:rPr>
-        <w:t xml:space="preserve"> </w:t>
-      </w:r>
-      <w:proofErr w:type="spellStart"/>
-      <w:r>
-        <w:rPr>
-          <w:rFonts w:ascii="Times New Roman" w:eastAsia="Times New Roman" w:hAnsi="Times New Roman" w:cs="Times New Roman"/>
-          <w:color w:val="EE0000"/>
-          <w:sz w:val="26"/>
-          <w:szCs w:val="26"/>
-        </w:rPr>
-        <w:t>mưa</w:t>
-      </w:r>
-      <w:proofErr w:type="spellEnd"/>
-      <w:r>
-        <w:rPr>
-          <w:rFonts w:ascii="Times New Roman" w:eastAsia="Times New Roman" w:hAnsi="Times New Roman" w:cs="Times New Roman"/>
-          <w:color w:val="EE0000"/>
-          <w:sz w:val="26"/>
-          <w:szCs w:val="26"/>
-        </w:rPr>
-        <w:t>)</w:t>
-      </w:r>
-      <w:r>
-        <w:rPr>
-          <w:rFonts w:ascii="Times New Roman" w:eastAsia="Times New Roman" w:hAnsi="Times New Roman" w:cs="Times New Roman"/>
-          <w:color w:val="EE0000"/>
-          <w:sz w:val="26"/>
-          <w:szCs w:val="26"/>
-          <w:lang w:val="vi-VN"/>
-        </w:rPr>
-        <w:t xml:space="preserve"> {time_mua_end}</w:t>
-      </w:r>
-      <w:r>
-        <w:rPr>
-          <w:rFonts w:ascii="Times New Roman" w:eastAsia="Times New Roman" w:hAnsi="Times New Roman" w:cs="Times New Roman"/>
-          <w:sz w:val="26"/>
-          <w:szCs w:val="26"/>
-        </w:rPr>
-        <w:t xml:space="preserve">, </w:t>
+        <w:t>{time_mua}</w:t>
+      </w:r>
+      <w:r>
+        <w:rPr>
+          <w:rFonts w:ascii="Times New Roman" w:eastAsia="Times New Roman" w:hAnsi="Times New Roman" w:cs="Times New Roman"/>
+          <w:color w:val="000000" w:themeColor="text1"/>
+          <w:sz w:val="26"/>
+          <w:szCs w:val="26"/>
+        </w:rPr>
+        <w:t xml:space="preserve"> </w:t>
       </w:r>
       <w:proofErr w:type="spellStart"/>
       <w:r>
@@ -4468,6 +4162,21 @@
         </w:rPr>
         <w:t>{table_mua_phuong}</w:t>
       </w:r>
+    </w:p>
+    <w:p>
+      <w:pPr>
+        <w:pStyle w:val="ListParagraph"/>
+        <w:spacing w:before="60" w:after="60" w:line="320" w:lineRule="exact"/>
+        <w:ind w:left="360"/>
+        <w:jc w:val="both"/>
+        <w:rPr>
+          <w:rFonts w:ascii="Times New Roman" w:eastAsia="Times New Roman" w:hAnsi="Times New Roman" w:cs="Times New Roman"/>
+          <w:color w:val="000000" w:themeColor="text1"/>
+          <w:sz w:val="26"/>
+          <w:szCs w:val="26"/>
+          <w:lang w:val="vi-VN"/>
+        </w:rPr>
+      </w:pPr>
     </w:p>
     <w:p>
       <w:pPr>
@@ -8237,7 +7946,6 @@
           <w:sz w:val="26"/>
           <w:szCs w:val="26"/>
         </w:rPr>
-        <w:lastRenderedPageBreak/>
         <w:t xml:space="preserve">Công </w:t>
       </w:r>
       <w:proofErr w:type="spellStart"/>
@@ -8440,6 +8148,7 @@
           <w:sz w:val="26"/>
           <w:szCs w:val="26"/>
         </w:rPr>
+        <w:lastRenderedPageBreak/>
         <w:t xml:space="preserve">- </w:t>
       </w:r>
       <w:proofErr w:type="spellStart"/>

</xml_diff>

<commit_message>
doc file noi dung emaol page
</commit_message>
<xml_diff>
--- a/ai_tnhn/ai-api-tnhn/doc/Báo cáo mưa ngày {dd}-{mm}-{yyyy} thời điểm {hh}.docx
+++ b/ai_tnhn/ai-api-tnhn/doc/Báo cáo mưa ngày {dd}-{mm}-{yyyy} thời điểm {hh}.docx
@@ -1764,1433 +1764,1433 @@
       <w:r>
         <w:rPr>
           <w:rFonts w:ascii="Times New Roman" w:eastAsia="Times New Roman" w:hAnsi="Times New Roman" w:cs="Times New Roman"/>
+          <w:color w:val="EE0000"/>
           <w:sz w:val="26"/>
           <w:szCs w:val="26"/>
         </w:rPr>
         <w:t xml:space="preserve">Do </w:t>
       </w:r>
-      <w:r>
-        <w:rPr>
-          <w:rFonts w:ascii="Times New Roman" w:eastAsia="Times New Roman" w:hAnsi="Times New Roman" w:cs="Times New Roman"/>
-          <w:sz w:val="26"/>
-          <w:szCs w:val="26"/>
-        </w:rPr>
-        <w:t>{</w:t>
-      </w:r>
-      <w:proofErr w:type="spellStart"/>
-      <w:r>
-        <w:rPr>
-          <w:rFonts w:ascii="Times New Roman" w:eastAsia="Times New Roman" w:hAnsi="Times New Roman" w:cs="Times New Roman"/>
-          <w:sz w:val="26"/>
-          <w:szCs w:val="26"/>
-        </w:rPr>
-        <w:t>mua</w:t>
-      </w:r>
-      <w:proofErr w:type="spellEnd"/>
-      <w:r>
-        <w:rPr>
-          <w:rFonts w:ascii="Times New Roman" w:eastAsia="Times New Roman" w:hAnsi="Times New Roman" w:cs="Times New Roman"/>
+      <w:proofErr w:type="spellStart"/>
+      <w:r>
+        <w:rPr>
+          <w:rFonts w:ascii="Times New Roman" w:eastAsia="Times New Roman" w:hAnsi="Times New Roman" w:cs="Times New Roman"/>
+          <w:color w:val="EE0000"/>
+          <w:sz w:val="26"/>
+          <w:szCs w:val="26"/>
+          <w:highlight w:val="yellow"/>
+        </w:rPr>
+        <w:t>ảnh</w:t>
+      </w:r>
+      <w:proofErr w:type="spellEnd"/>
+      <w:r>
+        <w:rPr>
+          <w:rFonts w:ascii="Times New Roman" w:eastAsia="Times New Roman" w:hAnsi="Times New Roman" w:cs="Times New Roman"/>
+          <w:color w:val="EE0000"/>
+          <w:sz w:val="26"/>
+          <w:szCs w:val="26"/>
+          <w:highlight w:val="yellow"/>
+        </w:rPr>
+        <w:t xml:space="preserve"> </w:t>
+      </w:r>
+      <w:proofErr w:type="spellStart"/>
+      <w:r>
+        <w:rPr>
+          <w:rFonts w:ascii="Times New Roman" w:eastAsia="Times New Roman" w:hAnsi="Times New Roman" w:cs="Times New Roman"/>
+          <w:color w:val="EE0000"/>
+          <w:sz w:val="26"/>
+          <w:szCs w:val="26"/>
+          <w:highlight w:val="yellow"/>
+        </w:rPr>
+        <w:t>hưởng</w:t>
+      </w:r>
+      <w:proofErr w:type="spellEnd"/>
+      <w:r>
+        <w:rPr>
+          <w:rFonts w:ascii="Times New Roman" w:eastAsia="Times New Roman" w:hAnsi="Times New Roman" w:cs="Times New Roman"/>
+          <w:color w:val="EE0000"/>
+          <w:sz w:val="26"/>
+          <w:szCs w:val="26"/>
+          <w:highlight w:val="yellow"/>
+        </w:rPr>
+        <w:t xml:space="preserve"> </w:t>
+      </w:r>
+      <w:proofErr w:type="spellStart"/>
+      <w:r>
+        <w:rPr>
+          <w:rFonts w:ascii="Times New Roman" w:eastAsia="Times New Roman" w:hAnsi="Times New Roman" w:cs="Times New Roman"/>
+          <w:color w:val="EE0000"/>
+          <w:sz w:val="26"/>
+          <w:szCs w:val="26"/>
+          <w:highlight w:val="yellow"/>
+        </w:rPr>
+        <w:t>của</w:t>
+      </w:r>
+      <w:proofErr w:type="spellEnd"/>
+      <w:r>
+        <w:rPr>
+          <w:rFonts w:ascii="Times New Roman" w:eastAsia="Times New Roman" w:hAnsi="Times New Roman" w:cs="Times New Roman"/>
+          <w:color w:val="EE0000"/>
+          <w:sz w:val="26"/>
+          <w:szCs w:val="26"/>
+          <w:highlight w:val="yellow"/>
+        </w:rPr>
+        <w:t xml:space="preserve"> do </w:t>
+      </w:r>
+      <w:proofErr w:type="spellStart"/>
+      <w:r>
+        <w:rPr>
+          <w:rFonts w:ascii="Times New Roman" w:eastAsia="Times New Roman" w:hAnsi="Times New Roman" w:cs="Times New Roman"/>
+          <w:color w:val="EE0000"/>
+          <w:sz w:val="26"/>
+          <w:szCs w:val="26"/>
+          <w:highlight w:val="yellow"/>
+        </w:rPr>
+        <w:t>ảnh</w:t>
+      </w:r>
+      <w:proofErr w:type="spellEnd"/>
+      <w:r>
+        <w:rPr>
+          <w:rFonts w:ascii="Times New Roman" w:eastAsia="Times New Roman" w:hAnsi="Times New Roman" w:cs="Times New Roman"/>
+          <w:color w:val="EE0000"/>
+          <w:sz w:val="26"/>
+          <w:szCs w:val="26"/>
+          <w:highlight w:val="yellow"/>
+        </w:rPr>
+        <w:t xml:space="preserve"> </w:t>
+      </w:r>
+      <w:proofErr w:type="spellStart"/>
+      <w:r>
+        <w:rPr>
+          <w:rFonts w:ascii="Times New Roman" w:eastAsia="Times New Roman" w:hAnsi="Times New Roman" w:cs="Times New Roman"/>
+          <w:color w:val="EE0000"/>
+          <w:sz w:val="26"/>
+          <w:szCs w:val="26"/>
+          <w:highlight w:val="yellow"/>
+        </w:rPr>
+        <w:t>hưởng</w:t>
+      </w:r>
+      <w:proofErr w:type="spellEnd"/>
+      <w:r>
+        <w:rPr>
+          <w:rFonts w:ascii="Times New Roman" w:eastAsia="Times New Roman" w:hAnsi="Times New Roman" w:cs="Times New Roman"/>
+          <w:color w:val="EE0000"/>
+          <w:sz w:val="26"/>
+          <w:szCs w:val="26"/>
+          <w:highlight w:val="yellow"/>
+        </w:rPr>
+        <w:t xml:space="preserve"> </w:t>
+      </w:r>
+      <w:proofErr w:type="spellStart"/>
+      <w:r>
+        <w:rPr>
+          <w:rFonts w:ascii="Times New Roman" w:eastAsia="Times New Roman" w:hAnsi="Times New Roman" w:cs="Times New Roman"/>
+          <w:color w:val="EE0000"/>
+          <w:sz w:val="26"/>
+          <w:szCs w:val="26"/>
+          <w:highlight w:val="yellow"/>
+        </w:rPr>
+        <w:t>của</w:t>
+      </w:r>
+      <w:proofErr w:type="spellEnd"/>
+      <w:r>
+        <w:rPr>
+          <w:rFonts w:ascii="Times New Roman" w:eastAsia="Times New Roman" w:hAnsi="Times New Roman" w:cs="Times New Roman"/>
+          <w:color w:val="EE0000"/>
+          <w:sz w:val="26"/>
+          <w:szCs w:val="26"/>
+          <w:highlight w:val="yellow"/>
+        </w:rPr>
+        <w:t xml:space="preserve"> </w:t>
+      </w:r>
+      <w:proofErr w:type="spellStart"/>
+      <w:r>
+        <w:rPr>
+          <w:rFonts w:ascii="Times New Roman" w:eastAsia="Times New Roman" w:hAnsi="Times New Roman" w:cs="Times New Roman"/>
+          <w:color w:val="EE0000"/>
+          <w:sz w:val="26"/>
+          <w:szCs w:val="26"/>
+          <w:highlight w:val="yellow"/>
+        </w:rPr>
+        <w:t>vùng</w:t>
+      </w:r>
+      <w:proofErr w:type="spellEnd"/>
+      <w:r>
+        <w:rPr>
+          <w:rFonts w:ascii="Times New Roman" w:eastAsia="Times New Roman" w:hAnsi="Times New Roman" w:cs="Times New Roman"/>
+          <w:color w:val="EE0000"/>
+          <w:sz w:val="26"/>
+          <w:szCs w:val="26"/>
+          <w:highlight w:val="yellow"/>
+        </w:rPr>
+        <w:t xml:space="preserve"> </w:t>
+      </w:r>
+      <w:proofErr w:type="spellStart"/>
+      <w:r>
+        <w:rPr>
+          <w:rFonts w:ascii="Times New Roman" w:eastAsia="Times New Roman" w:hAnsi="Times New Roman" w:cs="Times New Roman"/>
+          <w:color w:val="EE0000"/>
+          <w:sz w:val="26"/>
+          <w:szCs w:val="26"/>
+          <w:highlight w:val="yellow"/>
+        </w:rPr>
+        <w:t>mây</w:t>
+      </w:r>
+      <w:proofErr w:type="spellEnd"/>
+      <w:r>
+        <w:rPr>
+          <w:rFonts w:ascii="Times New Roman" w:eastAsia="Times New Roman" w:hAnsi="Times New Roman" w:cs="Times New Roman"/>
+          <w:color w:val="EE0000"/>
+          <w:sz w:val="26"/>
+          <w:szCs w:val="26"/>
+          <w:highlight w:val="yellow"/>
+        </w:rPr>
+        <w:t xml:space="preserve"> </w:t>
+      </w:r>
+      <w:proofErr w:type="spellStart"/>
+      <w:r>
+        <w:rPr>
+          <w:rFonts w:ascii="Times New Roman" w:eastAsia="Times New Roman" w:hAnsi="Times New Roman" w:cs="Times New Roman"/>
+          <w:color w:val="EE0000"/>
+          <w:sz w:val="26"/>
+          <w:szCs w:val="26"/>
+          <w:highlight w:val="yellow"/>
+        </w:rPr>
+        <w:t>đối</w:t>
+      </w:r>
+      <w:proofErr w:type="spellEnd"/>
+      <w:r>
+        <w:rPr>
+          <w:rFonts w:ascii="Times New Roman" w:eastAsia="Times New Roman" w:hAnsi="Times New Roman" w:cs="Times New Roman"/>
+          <w:color w:val="EE0000"/>
+          <w:sz w:val="26"/>
+          <w:szCs w:val="26"/>
+          <w:highlight w:val="yellow"/>
+        </w:rPr>
+        <w:t xml:space="preserve"> </w:t>
+      </w:r>
+      <w:proofErr w:type="spellStart"/>
+      <w:r>
+        <w:rPr>
+          <w:rFonts w:ascii="Times New Roman" w:eastAsia="Times New Roman" w:hAnsi="Times New Roman" w:cs="Times New Roman"/>
+          <w:color w:val="EE0000"/>
+          <w:sz w:val="26"/>
+          <w:szCs w:val="26"/>
+          <w:highlight w:val="yellow"/>
+        </w:rPr>
+        <w:t>lưu</w:t>
+      </w:r>
+      <w:proofErr w:type="spellEnd"/>
+      <w:r>
+        <w:rPr>
+          <w:rFonts w:ascii="Times New Roman" w:eastAsia="Times New Roman" w:hAnsi="Times New Roman" w:cs="Times New Roman"/>
+          <w:color w:val="EE0000"/>
+          <w:sz w:val="26"/>
+          <w:szCs w:val="26"/>
+        </w:rPr>
+        <w:t xml:space="preserve"> </w:t>
+      </w:r>
+      <w:r>
+        <w:rPr>
+          <w:rFonts w:ascii="Times New Roman" w:eastAsia="Times New Roman" w:hAnsi="Times New Roman" w:cs="Times New Roman"/>
+          <w:color w:val="EE0000"/>
+          <w:sz w:val="26"/>
+          <w:szCs w:val="26"/>
+          <w:highlight w:val="yellow"/>
+        </w:rPr>
+        <w:t>(</w:t>
+      </w:r>
+      <w:proofErr w:type="spellStart"/>
+      <w:r>
+        <w:rPr>
+          <w:rFonts w:ascii="Times New Roman" w:eastAsia="Times New Roman" w:hAnsi="Times New Roman" w:cs="Times New Roman"/>
+          <w:color w:val="EE0000"/>
+          <w:sz w:val="26"/>
+          <w:szCs w:val="26"/>
+          <w:highlight w:val="yellow"/>
+        </w:rPr>
+        <w:t>lấy</w:t>
+      </w:r>
+      <w:proofErr w:type="spellEnd"/>
+      <w:r>
+        <w:rPr>
+          <w:rFonts w:ascii="Times New Roman" w:eastAsia="Times New Roman" w:hAnsi="Times New Roman" w:cs="Times New Roman"/>
+          <w:color w:val="EE0000"/>
+          <w:sz w:val="26"/>
+          <w:szCs w:val="26"/>
+          <w:highlight w:val="yellow"/>
+        </w:rPr>
+        <w:t xml:space="preserve"> </w:t>
+      </w:r>
+      <w:proofErr w:type="spellStart"/>
+      <w:r>
+        <w:rPr>
+          <w:rFonts w:ascii="Times New Roman" w:eastAsia="Times New Roman" w:hAnsi="Times New Roman" w:cs="Times New Roman"/>
+          <w:color w:val="EE0000"/>
+          <w:sz w:val="26"/>
+          <w:szCs w:val="26"/>
+          <w:highlight w:val="yellow"/>
+        </w:rPr>
+        <w:t>thông</w:t>
+      </w:r>
+      <w:proofErr w:type="spellEnd"/>
+      <w:r>
+        <w:rPr>
+          <w:rFonts w:ascii="Times New Roman" w:eastAsia="Times New Roman" w:hAnsi="Times New Roman" w:cs="Times New Roman"/>
+          <w:color w:val="EE0000"/>
+          <w:sz w:val="26"/>
+          <w:szCs w:val="26"/>
+          <w:highlight w:val="yellow"/>
+        </w:rPr>
+        <w:t xml:space="preserve"> tin </w:t>
+      </w:r>
+      <w:proofErr w:type="spellStart"/>
+      <w:r>
+        <w:rPr>
+          <w:rFonts w:ascii="Times New Roman" w:eastAsia="Times New Roman" w:hAnsi="Times New Roman" w:cs="Times New Roman"/>
+          <w:color w:val="EE0000"/>
+          <w:sz w:val="26"/>
+          <w:szCs w:val="26"/>
+          <w:highlight w:val="yellow"/>
+        </w:rPr>
+        <w:t>trên</w:t>
+      </w:r>
+      <w:proofErr w:type="spellEnd"/>
+      <w:r>
+        <w:rPr>
+          <w:rFonts w:ascii="Times New Roman" w:eastAsia="Times New Roman" w:hAnsi="Times New Roman" w:cs="Times New Roman"/>
+          <w:color w:val="EE0000"/>
+          <w:sz w:val="26"/>
+          <w:szCs w:val="26"/>
+          <w:highlight w:val="yellow"/>
+        </w:rPr>
+        <w:t xml:space="preserve"> </w:t>
+      </w:r>
+      <w:proofErr w:type="spellStart"/>
+      <w:r>
+        <w:rPr>
+          <w:rFonts w:ascii="Times New Roman" w:eastAsia="Times New Roman" w:hAnsi="Times New Roman" w:cs="Times New Roman"/>
+          <w:color w:val="EE0000"/>
+          <w:sz w:val="26"/>
+          <w:szCs w:val="26"/>
+          <w:highlight w:val="yellow"/>
+        </w:rPr>
+        <w:t>bản</w:t>
+      </w:r>
+      <w:proofErr w:type="spellEnd"/>
+      <w:r>
+        <w:rPr>
+          <w:rFonts w:ascii="Times New Roman" w:eastAsia="Times New Roman" w:hAnsi="Times New Roman" w:cs="Times New Roman"/>
+          <w:color w:val="EE0000"/>
+          <w:sz w:val="26"/>
+          <w:szCs w:val="26"/>
+          <w:highlight w:val="yellow"/>
+        </w:rPr>
+        <w:t xml:space="preserve"> tin </w:t>
+      </w:r>
+      <w:proofErr w:type="spellStart"/>
+      <w:r>
+        <w:rPr>
+          <w:rFonts w:ascii="Times New Roman" w:eastAsia="Times New Roman" w:hAnsi="Times New Roman" w:cs="Times New Roman"/>
+          <w:color w:val="EE0000"/>
+          <w:sz w:val="26"/>
+          <w:szCs w:val="26"/>
+          <w:highlight w:val="yellow"/>
+        </w:rPr>
+        <w:t>cảnh</w:t>
+      </w:r>
+      <w:proofErr w:type="spellEnd"/>
+      <w:r>
+        <w:rPr>
+          <w:rFonts w:ascii="Times New Roman" w:eastAsia="Times New Roman" w:hAnsi="Times New Roman" w:cs="Times New Roman"/>
+          <w:color w:val="EE0000"/>
+          <w:sz w:val="26"/>
+          <w:szCs w:val="26"/>
+          <w:highlight w:val="yellow"/>
+        </w:rPr>
+        <w:t xml:space="preserve"> </w:t>
+      </w:r>
+      <w:proofErr w:type="spellStart"/>
+      <w:r>
+        <w:rPr>
+          <w:rFonts w:ascii="Times New Roman" w:eastAsia="Times New Roman" w:hAnsi="Times New Roman" w:cs="Times New Roman"/>
+          <w:color w:val="EE0000"/>
+          <w:sz w:val="26"/>
+          <w:szCs w:val="26"/>
+          <w:highlight w:val="yellow"/>
+        </w:rPr>
+        <w:t>báo</w:t>
+      </w:r>
+      <w:proofErr w:type="spellEnd"/>
+      <w:r>
+        <w:rPr>
+          <w:rFonts w:ascii="Times New Roman" w:eastAsia="Times New Roman" w:hAnsi="Times New Roman" w:cs="Times New Roman"/>
+          <w:color w:val="EE0000"/>
+          <w:sz w:val="26"/>
+          <w:szCs w:val="26"/>
+          <w:highlight w:val="yellow"/>
+        </w:rPr>
+        <w:t xml:space="preserve"> </w:t>
+      </w:r>
+      <w:proofErr w:type="spellStart"/>
+      <w:r>
+        <w:rPr>
+          <w:rFonts w:ascii="Times New Roman" w:eastAsia="Times New Roman" w:hAnsi="Times New Roman" w:cs="Times New Roman"/>
+          <w:color w:val="EE0000"/>
+          <w:sz w:val="26"/>
+          <w:szCs w:val="26"/>
+          <w:highlight w:val="yellow"/>
+        </w:rPr>
+        <w:t>của</w:t>
+      </w:r>
+      <w:proofErr w:type="spellEnd"/>
+      <w:r>
+        <w:rPr>
+          <w:rFonts w:ascii="Times New Roman" w:eastAsia="Times New Roman" w:hAnsi="Times New Roman" w:cs="Times New Roman"/>
+          <w:color w:val="EE0000"/>
+          <w:sz w:val="26"/>
+          <w:szCs w:val="26"/>
+          <w:highlight w:val="yellow"/>
+        </w:rPr>
+        <w:t xml:space="preserve"> </w:t>
+      </w:r>
+      <w:proofErr w:type="spellStart"/>
+      <w:r>
+        <w:rPr>
+          <w:rFonts w:ascii="Times New Roman" w:eastAsia="Times New Roman" w:hAnsi="Times New Roman" w:cs="Times New Roman"/>
+          <w:color w:val="EE0000"/>
+          <w:sz w:val="26"/>
+          <w:szCs w:val="26"/>
+          <w:highlight w:val="yellow"/>
+        </w:rPr>
+        <w:t>khí</w:t>
+      </w:r>
+      <w:proofErr w:type="spellEnd"/>
+      <w:r>
+        <w:rPr>
+          <w:rFonts w:ascii="Times New Roman" w:eastAsia="Times New Roman" w:hAnsi="Times New Roman" w:cs="Times New Roman"/>
+          <w:color w:val="EE0000"/>
+          <w:sz w:val="26"/>
+          <w:szCs w:val="26"/>
+          <w:highlight w:val="yellow"/>
+        </w:rPr>
+        <w:t xml:space="preserve"> </w:t>
+      </w:r>
+      <w:proofErr w:type="spellStart"/>
+      <w:r>
+        <w:rPr>
+          <w:rFonts w:ascii="Times New Roman" w:eastAsia="Times New Roman" w:hAnsi="Times New Roman" w:cs="Times New Roman"/>
+          <w:color w:val="EE0000"/>
+          <w:sz w:val="26"/>
+          <w:szCs w:val="26"/>
+          <w:highlight w:val="yellow"/>
+        </w:rPr>
+        <w:t>tượng</w:t>
+      </w:r>
+      <w:proofErr w:type="spellEnd"/>
+      <w:r>
+        <w:rPr>
+          <w:rFonts w:ascii="Times New Roman" w:eastAsia="Times New Roman" w:hAnsi="Times New Roman" w:cs="Times New Roman"/>
+          <w:color w:val="EE0000"/>
+          <w:sz w:val="26"/>
+          <w:szCs w:val="26"/>
+          <w:highlight w:val="yellow"/>
+        </w:rPr>
+        <w:t xml:space="preserve"> </w:t>
+      </w:r>
+      <w:proofErr w:type="spellStart"/>
+      <w:r>
+        <w:rPr>
+          <w:rFonts w:ascii="Times New Roman" w:eastAsia="Times New Roman" w:hAnsi="Times New Roman" w:cs="Times New Roman"/>
+          <w:color w:val="EE0000"/>
+          <w:sz w:val="26"/>
+          <w:szCs w:val="26"/>
+          <w:highlight w:val="yellow"/>
+        </w:rPr>
+        <w:t>thuỷ</w:t>
+      </w:r>
+      <w:proofErr w:type="spellEnd"/>
+      <w:r>
+        <w:rPr>
+          <w:rFonts w:ascii="Times New Roman" w:eastAsia="Times New Roman" w:hAnsi="Times New Roman" w:cs="Times New Roman"/>
+          <w:color w:val="EE0000"/>
+          <w:sz w:val="26"/>
+          <w:szCs w:val="26"/>
+          <w:highlight w:val="yellow"/>
+        </w:rPr>
+        <w:t xml:space="preserve"> </w:t>
+      </w:r>
+      <w:proofErr w:type="spellStart"/>
+      <w:r>
+        <w:rPr>
+          <w:rFonts w:ascii="Times New Roman" w:eastAsia="Times New Roman" w:hAnsi="Times New Roman" w:cs="Times New Roman"/>
+          <w:color w:val="EE0000"/>
+          <w:sz w:val="26"/>
+          <w:szCs w:val="26"/>
+          <w:highlight w:val="yellow"/>
+        </w:rPr>
+        <w:t>văn</w:t>
+      </w:r>
+      <w:proofErr w:type="spellEnd"/>
+      <w:r>
+        <w:rPr>
+          <w:rFonts w:ascii="Times New Roman" w:eastAsia="Times New Roman" w:hAnsi="Times New Roman" w:cs="Times New Roman"/>
+          <w:color w:val="EE0000"/>
+          <w:sz w:val="26"/>
+          <w:szCs w:val="26"/>
+          <w:highlight w:val="yellow"/>
+        </w:rPr>
+        <w:t xml:space="preserve"> </w:t>
+      </w:r>
+      <w:proofErr w:type="spellStart"/>
+      <w:r>
+        <w:rPr>
+          <w:rFonts w:ascii="Times New Roman" w:eastAsia="Times New Roman" w:hAnsi="Times New Roman" w:cs="Times New Roman"/>
+          <w:color w:val="EE0000"/>
+          <w:sz w:val="26"/>
+          <w:szCs w:val="26"/>
+          <w:highlight w:val="yellow"/>
+        </w:rPr>
+        <w:t>đồng</w:t>
+      </w:r>
+      <w:proofErr w:type="spellEnd"/>
+      <w:r>
+        <w:rPr>
+          <w:rFonts w:ascii="Times New Roman" w:eastAsia="Times New Roman" w:hAnsi="Times New Roman" w:cs="Times New Roman"/>
+          <w:color w:val="EE0000"/>
+          <w:sz w:val="26"/>
+          <w:szCs w:val="26"/>
+          <w:highlight w:val="yellow"/>
+        </w:rPr>
+        <w:t xml:space="preserve"> </w:t>
+      </w:r>
+      <w:proofErr w:type="spellStart"/>
+      <w:r>
+        <w:rPr>
+          <w:rFonts w:ascii="Times New Roman" w:eastAsia="Times New Roman" w:hAnsi="Times New Roman" w:cs="Times New Roman"/>
+          <w:color w:val="EE0000"/>
+          <w:sz w:val="26"/>
+          <w:szCs w:val="26"/>
+          <w:highlight w:val="yellow"/>
+        </w:rPr>
+        <w:t>bằng</w:t>
+      </w:r>
+      <w:proofErr w:type="spellEnd"/>
+      <w:r>
+        <w:rPr>
+          <w:rFonts w:ascii="Times New Roman" w:eastAsia="Times New Roman" w:hAnsi="Times New Roman" w:cs="Times New Roman"/>
+          <w:color w:val="EE0000"/>
+          <w:sz w:val="26"/>
+          <w:szCs w:val="26"/>
+          <w:highlight w:val="yellow"/>
+        </w:rPr>
+        <w:t xml:space="preserve"> </w:t>
+      </w:r>
+      <w:proofErr w:type="spellStart"/>
+      <w:r>
+        <w:rPr>
+          <w:rFonts w:ascii="Times New Roman" w:eastAsia="Times New Roman" w:hAnsi="Times New Roman" w:cs="Times New Roman"/>
+          <w:color w:val="EE0000"/>
+          <w:sz w:val="26"/>
+          <w:szCs w:val="26"/>
+          <w:highlight w:val="yellow"/>
+        </w:rPr>
+        <w:t>bắc</w:t>
+      </w:r>
+      <w:proofErr w:type="spellEnd"/>
+      <w:r>
+        <w:rPr>
+          <w:rFonts w:ascii="Times New Roman" w:eastAsia="Times New Roman" w:hAnsi="Times New Roman" w:cs="Times New Roman"/>
+          <w:color w:val="EE0000"/>
+          <w:sz w:val="26"/>
+          <w:szCs w:val="26"/>
+          <w:highlight w:val="yellow"/>
+        </w:rPr>
+        <w:t xml:space="preserve"> </w:t>
+      </w:r>
+      <w:proofErr w:type="spellStart"/>
+      <w:r>
+        <w:rPr>
+          <w:rFonts w:ascii="Times New Roman" w:eastAsia="Times New Roman" w:hAnsi="Times New Roman" w:cs="Times New Roman"/>
+          <w:color w:val="EE0000"/>
+          <w:sz w:val="26"/>
+          <w:szCs w:val="26"/>
+          <w:highlight w:val="yellow"/>
+        </w:rPr>
+        <w:t>bộ</w:t>
+      </w:r>
+      <w:proofErr w:type="spellEnd"/>
+      <w:r>
+        <w:rPr>
+          <w:rFonts w:ascii="Times New Roman" w:eastAsia="Times New Roman" w:hAnsi="Times New Roman" w:cs="Times New Roman"/>
+          <w:color w:val="EE0000"/>
+          <w:sz w:val="26"/>
+          <w:szCs w:val="26"/>
+          <w:highlight w:val="yellow"/>
+        </w:rPr>
+        <w:t xml:space="preserve"> email </w:t>
+      </w:r>
+      <w:proofErr w:type="spellStart"/>
+      <w:r>
+        <w:rPr>
+          <w:rFonts w:ascii="Times New Roman" w:eastAsia="Times New Roman" w:hAnsi="Times New Roman" w:cs="Times New Roman"/>
+          <w:color w:val="EE0000"/>
+          <w:sz w:val="26"/>
+          <w:szCs w:val="26"/>
+          <w:highlight w:val="yellow"/>
+        </w:rPr>
+        <w:t>hoặc</w:t>
+      </w:r>
+      <w:proofErr w:type="spellEnd"/>
+      <w:r>
+        <w:rPr>
+          <w:rFonts w:ascii="Times New Roman" w:eastAsia="Times New Roman" w:hAnsi="Times New Roman" w:cs="Times New Roman"/>
+          <w:color w:val="EE0000"/>
+          <w:sz w:val="26"/>
+          <w:szCs w:val="26"/>
+          <w:highlight w:val="yellow"/>
+        </w:rPr>
+        <w:t xml:space="preserve"> website)</w:t>
+      </w:r>
+      <w:r>
+        <w:rPr>
+          <w:rFonts w:ascii="Times New Roman" w:eastAsia="Times New Roman" w:hAnsi="Times New Roman" w:cs="Times New Roman"/>
+          <w:color w:val="EE0000"/>
+          <w:sz w:val="26"/>
+          <w:szCs w:val="26"/>
+        </w:rPr>
+        <w:t xml:space="preserve"> </w:t>
+      </w:r>
+      <w:proofErr w:type="spellStart"/>
+      <w:r>
+        <w:rPr>
+          <w:rFonts w:ascii="Times New Roman" w:eastAsia="Times New Roman" w:hAnsi="Times New Roman" w:cs="Times New Roman"/>
+          <w:color w:val="EE0000"/>
+          <w:sz w:val="26"/>
+          <w:szCs w:val="26"/>
+        </w:rPr>
+        <w:t>địa</w:t>
+      </w:r>
+      <w:proofErr w:type="spellEnd"/>
+      <w:r>
+        <w:rPr>
+          <w:rFonts w:ascii="Times New Roman" w:eastAsia="Times New Roman" w:hAnsi="Times New Roman" w:cs="Times New Roman"/>
+          <w:color w:val="EE0000"/>
+          <w:sz w:val="26"/>
+          <w:szCs w:val="26"/>
+        </w:rPr>
+        <w:t xml:space="preserve"> </w:t>
+      </w:r>
+      <w:proofErr w:type="spellStart"/>
+      <w:r>
+        <w:rPr>
+          <w:rFonts w:ascii="Times New Roman" w:eastAsia="Times New Roman" w:hAnsi="Times New Roman" w:cs="Times New Roman"/>
+          <w:color w:val="EE0000"/>
+          <w:sz w:val="26"/>
+          <w:szCs w:val="26"/>
+        </w:rPr>
+        <w:t>bàn</w:t>
+      </w:r>
+      <w:proofErr w:type="spellEnd"/>
+      <w:r>
+        <w:rPr>
+          <w:rFonts w:ascii="Times New Roman" w:eastAsia="Times New Roman" w:hAnsi="Times New Roman" w:cs="Times New Roman"/>
+          <w:color w:val="EE0000"/>
+          <w:sz w:val="26"/>
+          <w:szCs w:val="26"/>
+        </w:rPr>
+        <w:t xml:space="preserve"> Thành </w:t>
+      </w:r>
+      <w:proofErr w:type="spellStart"/>
+      <w:r>
+        <w:rPr>
+          <w:rFonts w:ascii="Times New Roman" w:eastAsia="Times New Roman" w:hAnsi="Times New Roman" w:cs="Times New Roman"/>
+          <w:color w:val="EE0000"/>
+          <w:sz w:val="26"/>
+          <w:szCs w:val="26"/>
+        </w:rPr>
+        <w:t>phố</w:t>
+      </w:r>
+      <w:proofErr w:type="spellEnd"/>
+      <w:r>
+        <w:rPr>
+          <w:rFonts w:ascii="Times New Roman" w:eastAsia="Times New Roman" w:hAnsi="Times New Roman" w:cs="Times New Roman"/>
+          <w:color w:val="EE0000"/>
+          <w:sz w:val="26"/>
+          <w:szCs w:val="26"/>
+        </w:rPr>
+        <w:t xml:space="preserve"> </w:t>
+      </w:r>
+      <w:proofErr w:type="spellStart"/>
+      <w:r>
+        <w:rPr>
+          <w:rFonts w:ascii="Times New Roman" w:eastAsia="Times New Roman" w:hAnsi="Times New Roman" w:cs="Times New Roman"/>
+          <w:color w:val="EE0000"/>
+          <w:sz w:val="26"/>
+          <w:szCs w:val="26"/>
+        </w:rPr>
+        <w:t>có</w:t>
+      </w:r>
+      <w:proofErr w:type="spellEnd"/>
+      <w:r>
+        <w:rPr>
+          <w:rFonts w:ascii="Times New Roman" w:eastAsia="Times New Roman" w:hAnsi="Times New Roman" w:cs="Times New Roman"/>
+          <w:color w:val="EE0000"/>
+          <w:sz w:val="26"/>
+          <w:szCs w:val="26"/>
+        </w:rPr>
+        <w:t xml:space="preserve"> </w:t>
+      </w:r>
+      <w:proofErr w:type="spellStart"/>
+      <w:r>
+        <w:rPr>
+          <w:rFonts w:ascii="Times New Roman" w:eastAsia="Times New Roman" w:hAnsi="Times New Roman" w:cs="Times New Roman"/>
+          <w:color w:val="EE0000"/>
+          <w:sz w:val="26"/>
+          <w:szCs w:val="26"/>
+        </w:rPr>
+        <w:t>Mưa</w:t>
+      </w:r>
+      <w:proofErr w:type="spellEnd"/>
+      <w:r>
+        <w:rPr>
+          <w:rFonts w:ascii="Times New Roman" w:eastAsia="Times New Roman" w:hAnsi="Times New Roman" w:cs="Times New Roman"/>
+          <w:color w:val="EE0000"/>
+          <w:sz w:val="26"/>
+          <w:szCs w:val="26"/>
+        </w:rPr>
+        <w:t xml:space="preserve"> </w:t>
+      </w:r>
+      <w:proofErr w:type="spellStart"/>
+      <w:r>
+        <w:rPr>
+          <w:rFonts w:ascii="Times New Roman" w:eastAsia="Times New Roman" w:hAnsi="Times New Roman" w:cs="Times New Roman"/>
+          <w:color w:val="EE0000"/>
+          <w:sz w:val="26"/>
+          <w:szCs w:val="26"/>
+          <w:highlight w:val="yellow"/>
+        </w:rPr>
+        <w:t>nhỏ</w:t>
+      </w:r>
+      <w:proofErr w:type="spellEnd"/>
+      <w:r>
+        <w:rPr>
+          <w:rFonts w:ascii="Times New Roman" w:eastAsia="Times New Roman" w:hAnsi="Times New Roman" w:cs="Times New Roman"/>
+          <w:color w:val="EE0000"/>
+          <w:sz w:val="26"/>
+          <w:szCs w:val="26"/>
+          <w:highlight w:val="yellow"/>
+        </w:rPr>
+        <w:t xml:space="preserve"> </w:t>
+      </w:r>
+      <w:proofErr w:type="spellStart"/>
+      <w:r>
+        <w:rPr>
+          <w:rFonts w:ascii="Times New Roman" w:eastAsia="Times New Roman" w:hAnsi="Times New Roman" w:cs="Times New Roman"/>
+          <w:color w:val="EE0000"/>
+          <w:sz w:val="26"/>
+          <w:szCs w:val="26"/>
+          <w:highlight w:val="yellow"/>
+        </w:rPr>
+        <w:t>rải</w:t>
+      </w:r>
+      <w:proofErr w:type="spellEnd"/>
+      <w:r>
+        <w:rPr>
+          <w:rFonts w:ascii="Times New Roman" w:eastAsia="Times New Roman" w:hAnsi="Times New Roman" w:cs="Times New Roman"/>
+          <w:color w:val="EE0000"/>
+          <w:sz w:val="26"/>
+          <w:szCs w:val="26"/>
+          <w:highlight w:val="yellow"/>
+        </w:rPr>
+        <w:t xml:space="preserve"> </w:t>
+      </w:r>
+      <w:proofErr w:type="spellStart"/>
+      <w:r>
+        <w:rPr>
+          <w:rFonts w:ascii="Times New Roman" w:eastAsia="Times New Roman" w:hAnsi="Times New Roman" w:cs="Times New Roman"/>
+          <w:color w:val="EE0000"/>
+          <w:sz w:val="26"/>
+          <w:szCs w:val="26"/>
+          <w:highlight w:val="yellow"/>
+        </w:rPr>
+        <w:t>rác</w:t>
+      </w:r>
+      <w:proofErr w:type="spellEnd"/>
+      <w:r>
+        <w:rPr>
+          <w:rFonts w:ascii="Times New Roman" w:eastAsia="Times New Roman" w:hAnsi="Times New Roman" w:cs="Times New Roman"/>
+          <w:color w:val="EE0000"/>
+          <w:sz w:val="26"/>
+          <w:szCs w:val="26"/>
+          <w:highlight w:val="yellow"/>
+        </w:rPr>
+        <w:t xml:space="preserve"> </w:t>
+      </w:r>
+      <w:proofErr w:type="spellStart"/>
+      <w:r>
+        <w:rPr>
+          <w:rFonts w:ascii="Times New Roman" w:eastAsia="Times New Roman" w:hAnsi="Times New Roman" w:cs="Times New Roman"/>
+          <w:color w:val="EE0000"/>
+          <w:sz w:val="26"/>
+          <w:szCs w:val="26"/>
+          <w:highlight w:val="yellow"/>
+        </w:rPr>
+        <w:t>trên</w:t>
+      </w:r>
+      <w:proofErr w:type="spellEnd"/>
+      <w:r>
+        <w:rPr>
+          <w:rFonts w:ascii="Times New Roman" w:eastAsia="Times New Roman" w:hAnsi="Times New Roman" w:cs="Times New Roman"/>
+          <w:color w:val="EE0000"/>
+          <w:sz w:val="26"/>
+          <w:szCs w:val="26"/>
+          <w:highlight w:val="yellow"/>
+        </w:rPr>
+        <w:t xml:space="preserve"> </w:t>
+      </w:r>
+      <w:proofErr w:type="spellStart"/>
+      <w:r>
+        <w:rPr>
+          <w:rFonts w:ascii="Times New Roman" w:eastAsia="Times New Roman" w:hAnsi="Times New Roman" w:cs="Times New Roman"/>
+          <w:color w:val="EE0000"/>
+          <w:sz w:val="26"/>
+          <w:szCs w:val="26"/>
+          <w:highlight w:val="yellow"/>
+        </w:rPr>
+        <w:t>diện</w:t>
+      </w:r>
+      <w:proofErr w:type="spellEnd"/>
+      <w:r>
+        <w:rPr>
+          <w:rFonts w:ascii="Times New Roman" w:eastAsia="Times New Roman" w:hAnsi="Times New Roman" w:cs="Times New Roman"/>
+          <w:color w:val="EE0000"/>
+          <w:sz w:val="26"/>
+          <w:szCs w:val="26"/>
+          <w:highlight w:val="yellow"/>
+        </w:rPr>
+        <w:t xml:space="preserve"> </w:t>
+      </w:r>
+      <w:proofErr w:type="spellStart"/>
+      <w:r>
+        <w:rPr>
+          <w:rFonts w:ascii="Times New Roman" w:eastAsia="Times New Roman" w:hAnsi="Times New Roman" w:cs="Times New Roman"/>
+          <w:color w:val="EE0000"/>
+          <w:sz w:val="26"/>
+          <w:szCs w:val="26"/>
+          <w:highlight w:val="yellow"/>
+        </w:rPr>
+        <w:t>rộng</w:t>
+      </w:r>
+      <w:proofErr w:type="spellEnd"/>
+      <w:r>
+        <w:rPr>
+          <w:rFonts w:ascii="Times New Roman" w:eastAsia="Times New Roman" w:hAnsi="Times New Roman" w:cs="Times New Roman"/>
+          <w:color w:val="EE0000"/>
+          <w:sz w:val="26"/>
+          <w:szCs w:val="26"/>
+        </w:rPr>
+        <w:t xml:space="preserve"> (</w:t>
+      </w:r>
+      <w:proofErr w:type="spellStart"/>
+      <w:r>
+        <w:rPr>
+          <w:rFonts w:ascii="Times New Roman" w:eastAsia="Times New Roman" w:hAnsi="Times New Roman" w:cs="Times New Roman"/>
+          <w:color w:val="EE0000"/>
+          <w:sz w:val="26"/>
+          <w:szCs w:val="26"/>
+        </w:rPr>
+        <w:t>nếu</w:t>
+      </w:r>
+      <w:proofErr w:type="spellEnd"/>
+      <w:r>
+        <w:rPr>
+          <w:rFonts w:ascii="Times New Roman" w:eastAsia="Times New Roman" w:hAnsi="Times New Roman" w:cs="Times New Roman"/>
+          <w:color w:val="EE0000"/>
+          <w:sz w:val="26"/>
+          <w:szCs w:val="26"/>
+        </w:rPr>
+        <w:t xml:space="preserve"> </w:t>
+      </w:r>
+      <w:proofErr w:type="spellStart"/>
+      <w:r>
+        <w:rPr>
+          <w:rFonts w:ascii="Times New Roman" w:eastAsia="Times New Roman" w:hAnsi="Times New Roman" w:cs="Times New Roman"/>
+          <w:color w:val="EE0000"/>
+          <w:sz w:val="26"/>
+          <w:szCs w:val="26"/>
+        </w:rPr>
+        <w:t>mưa</w:t>
+      </w:r>
+      <w:proofErr w:type="spellEnd"/>
+      <w:r>
+        <w:rPr>
+          <w:rFonts w:ascii="Times New Roman" w:eastAsia="Times New Roman" w:hAnsi="Times New Roman" w:cs="Times New Roman"/>
+          <w:color w:val="EE0000"/>
+          <w:sz w:val="26"/>
+          <w:szCs w:val="26"/>
+        </w:rPr>
+        <w:t xml:space="preserve"> </w:t>
+      </w:r>
+      <w:proofErr w:type="spellStart"/>
+      <w:r>
+        <w:rPr>
+          <w:rFonts w:ascii="Times New Roman" w:eastAsia="Times New Roman" w:hAnsi="Times New Roman" w:cs="Times New Roman"/>
+          <w:color w:val="EE0000"/>
+          <w:sz w:val="26"/>
+          <w:szCs w:val="26"/>
+        </w:rPr>
+        <w:t>trên</w:t>
+      </w:r>
+      <w:proofErr w:type="spellEnd"/>
+      <w:r>
+        <w:rPr>
+          <w:rFonts w:ascii="Times New Roman" w:eastAsia="Times New Roman" w:hAnsi="Times New Roman" w:cs="Times New Roman"/>
+          <w:color w:val="EE0000"/>
+          <w:sz w:val="26"/>
+          <w:szCs w:val="26"/>
+        </w:rPr>
+        <w:t xml:space="preserve"> </w:t>
+      </w:r>
+      <w:proofErr w:type="spellStart"/>
+      <w:r>
+        <w:rPr>
+          <w:rFonts w:ascii="Times New Roman" w:eastAsia="Times New Roman" w:hAnsi="Times New Roman" w:cs="Times New Roman"/>
+          <w:color w:val="EE0000"/>
+          <w:sz w:val="26"/>
+          <w:szCs w:val="26"/>
+        </w:rPr>
+        <w:t>nhiều</w:t>
+      </w:r>
+      <w:proofErr w:type="spellEnd"/>
+      <w:r>
+        <w:rPr>
+          <w:rFonts w:ascii="Times New Roman" w:eastAsia="Times New Roman" w:hAnsi="Times New Roman" w:cs="Times New Roman"/>
+          <w:color w:val="EE0000"/>
+          <w:sz w:val="26"/>
+          <w:szCs w:val="26"/>
+        </w:rPr>
+        <w:t xml:space="preserve"> </w:t>
+      </w:r>
+      <w:proofErr w:type="spellStart"/>
+      <w:r>
+        <w:rPr>
+          <w:rFonts w:ascii="Times New Roman" w:eastAsia="Times New Roman" w:hAnsi="Times New Roman" w:cs="Times New Roman"/>
+          <w:color w:val="EE0000"/>
+          <w:sz w:val="26"/>
+          <w:szCs w:val="26"/>
+        </w:rPr>
+        <w:t>điểm</w:t>
+      </w:r>
+      <w:proofErr w:type="spellEnd"/>
+      <w:r>
+        <w:rPr>
+          <w:rFonts w:ascii="Times New Roman" w:eastAsia="Times New Roman" w:hAnsi="Times New Roman" w:cs="Times New Roman"/>
+          <w:color w:val="EE0000"/>
+          <w:sz w:val="26"/>
+          <w:szCs w:val="26"/>
+        </w:rPr>
+        <w:t xml:space="preserve"> </w:t>
+      </w:r>
+      <w:proofErr w:type="spellStart"/>
+      <w:r>
+        <w:rPr>
+          <w:rFonts w:ascii="Times New Roman" w:eastAsia="Times New Roman" w:hAnsi="Times New Roman" w:cs="Times New Roman"/>
+          <w:color w:val="EE0000"/>
+          <w:sz w:val="26"/>
+          <w:szCs w:val="26"/>
+        </w:rPr>
+        <w:t>tại</w:t>
+      </w:r>
+      <w:proofErr w:type="spellEnd"/>
+      <w:r>
+        <w:rPr>
+          <w:rFonts w:ascii="Times New Roman" w:eastAsia="Times New Roman" w:hAnsi="Times New Roman" w:cs="Times New Roman"/>
+          <w:color w:val="EE0000"/>
+          <w:sz w:val="26"/>
+          <w:szCs w:val="26"/>
+        </w:rPr>
+        <w:t xml:space="preserve"> </w:t>
+      </w:r>
+      <w:proofErr w:type="spellStart"/>
+      <w:r>
+        <w:rPr>
+          <w:rFonts w:ascii="Times New Roman" w:eastAsia="Times New Roman" w:hAnsi="Times New Roman" w:cs="Times New Roman"/>
+          <w:color w:val="EE0000"/>
+          <w:sz w:val="26"/>
+          <w:szCs w:val="26"/>
+        </w:rPr>
+        <w:t>bảng</w:t>
+      </w:r>
+      <w:proofErr w:type="spellEnd"/>
+      <w:r>
+        <w:rPr>
+          <w:rFonts w:ascii="Times New Roman" w:eastAsia="Times New Roman" w:hAnsi="Times New Roman" w:cs="Times New Roman"/>
+          <w:color w:val="EE0000"/>
+          <w:sz w:val="26"/>
+          <w:szCs w:val="26"/>
+        </w:rPr>
+        <w:t xml:space="preserve"> </w:t>
+      </w:r>
+      <w:proofErr w:type="spellStart"/>
+      <w:r>
+        <w:rPr>
+          <w:rFonts w:ascii="Times New Roman" w:eastAsia="Times New Roman" w:hAnsi="Times New Roman" w:cs="Times New Roman"/>
+          <w:color w:val="EE0000"/>
+          <w:sz w:val="26"/>
+          <w:szCs w:val="26"/>
+        </w:rPr>
+        <w:t>thì</w:t>
+      </w:r>
+      <w:proofErr w:type="spellEnd"/>
+      <w:r>
+        <w:rPr>
+          <w:rFonts w:ascii="Times New Roman" w:eastAsia="Times New Roman" w:hAnsi="Times New Roman" w:cs="Times New Roman"/>
+          <w:color w:val="EE0000"/>
+          <w:sz w:val="26"/>
+          <w:szCs w:val="26"/>
+        </w:rPr>
+        <w:t xml:space="preserve"> </w:t>
+      </w:r>
+      <w:proofErr w:type="spellStart"/>
+      <w:r>
+        <w:rPr>
+          <w:rFonts w:ascii="Times New Roman" w:eastAsia="Times New Roman" w:hAnsi="Times New Roman" w:cs="Times New Roman"/>
+          <w:color w:val="EE0000"/>
+          <w:sz w:val="26"/>
+          <w:szCs w:val="26"/>
+        </w:rPr>
+        <w:t>nó</w:t>
+      </w:r>
+      <w:proofErr w:type="spellEnd"/>
+      <w:r>
+        <w:rPr>
+          <w:rFonts w:ascii="Times New Roman" w:eastAsia="Times New Roman" w:hAnsi="Times New Roman" w:cs="Times New Roman"/>
+          <w:color w:val="EE0000"/>
+          <w:sz w:val="26"/>
+          <w:szCs w:val="26"/>
+        </w:rPr>
+        <w:t xml:space="preserve"> </w:t>
+      </w:r>
+      <w:proofErr w:type="spellStart"/>
+      <w:r>
+        <w:rPr>
+          <w:rFonts w:ascii="Times New Roman" w:eastAsia="Times New Roman" w:hAnsi="Times New Roman" w:cs="Times New Roman"/>
+          <w:color w:val="EE0000"/>
+          <w:sz w:val="26"/>
+          <w:szCs w:val="26"/>
+        </w:rPr>
+        <w:t>sẽ</w:t>
+      </w:r>
+      <w:proofErr w:type="spellEnd"/>
+      <w:r>
+        <w:rPr>
+          <w:rFonts w:ascii="Times New Roman" w:eastAsia="Times New Roman" w:hAnsi="Times New Roman" w:cs="Times New Roman"/>
+          <w:color w:val="EE0000"/>
+          <w:sz w:val="26"/>
+          <w:szCs w:val="26"/>
+        </w:rPr>
+        <w:t xml:space="preserve"> </w:t>
+      </w:r>
+      <w:proofErr w:type="spellStart"/>
+      <w:r>
+        <w:rPr>
+          <w:rFonts w:ascii="Times New Roman" w:eastAsia="Times New Roman" w:hAnsi="Times New Roman" w:cs="Times New Roman"/>
+          <w:color w:val="EE0000"/>
+          <w:sz w:val="26"/>
+          <w:szCs w:val="26"/>
+        </w:rPr>
+        <w:t>tự</w:t>
+      </w:r>
+      <w:proofErr w:type="spellEnd"/>
+      <w:r>
+        <w:rPr>
+          <w:rFonts w:ascii="Times New Roman" w:eastAsia="Times New Roman" w:hAnsi="Times New Roman" w:cs="Times New Roman"/>
+          <w:color w:val="EE0000"/>
+          <w:sz w:val="26"/>
+          <w:szCs w:val="26"/>
+        </w:rPr>
+        <w:t xml:space="preserve"> </w:t>
+      </w:r>
+      <w:proofErr w:type="spellStart"/>
+      <w:r>
+        <w:rPr>
+          <w:rFonts w:ascii="Times New Roman" w:eastAsia="Times New Roman" w:hAnsi="Times New Roman" w:cs="Times New Roman"/>
+          <w:color w:val="EE0000"/>
+          <w:sz w:val="26"/>
+          <w:szCs w:val="26"/>
+        </w:rPr>
+        <w:t>động</w:t>
+      </w:r>
+      <w:proofErr w:type="spellEnd"/>
+      <w:r>
+        <w:rPr>
+          <w:rFonts w:ascii="Times New Roman" w:eastAsia="Times New Roman" w:hAnsi="Times New Roman" w:cs="Times New Roman"/>
+          <w:color w:val="EE0000"/>
+          <w:sz w:val="26"/>
+          <w:szCs w:val="26"/>
+        </w:rPr>
+        <w:t xml:space="preserve"> </w:t>
+      </w:r>
+      <w:proofErr w:type="spellStart"/>
+      <w:r>
+        <w:rPr>
+          <w:rFonts w:ascii="Times New Roman" w:eastAsia="Times New Roman" w:hAnsi="Times New Roman" w:cs="Times New Roman"/>
+          <w:color w:val="EE0000"/>
+          <w:sz w:val="26"/>
+          <w:szCs w:val="26"/>
+        </w:rPr>
+        <w:t>ghi</w:t>
+      </w:r>
+      <w:proofErr w:type="spellEnd"/>
+      <w:r>
+        <w:rPr>
+          <w:rFonts w:ascii="Times New Roman" w:eastAsia="Times New Roman" w:hAnsi="Times New Roman" w:cs="Times New Roman"/>
+          <w:color w:val="EE0000"/>
+          <w:sz w:val="26"/>
+          <w:szCs w:val="26"/>
+        </w:rPr>
+        <w:t xml:space="preserve"> </w:t>
+      </w:r>
+      <w:proofErr w:type="spellStart"/>
+      <w:r>
+        <w:rPr>
+          <w:rFonts w:ascii="Times New Roman" w:eastAsia="Times New Roman" w:hAnsi="Times New Roman" w:cs="Times New Roman"/>
+          <w:color w:val="EE0000"/>
+          <w:sz w:val="26"/>
+          <w:szCs w:val="26"/>
+        </w:rPr>
+        <w:t>là</w:t>
+      </w:r>
+      <w:proofErr w:type="spellEnd"/>
+      <w:r>
+        <w:rPr>
+          <w:rFonts w:ascii="Times New Roman" w:eastAsia="Times New Roman" w:hAnsi="Times New Roman" w:cs="Times New Roman"/>
+          <w:color w:val="EE0000"/>
+          <w:sz w:val="26"/>
+          <w:szCs w:val="26"/>
+        </w:rPr>
+        <w:t xml:space="preserve"> </w:t>
+      </w:r>
+      <w:proofErr w:type="spellStart"/>
+      <w:r>
+        <w:rPr>
+          <w:rFonts w:ascii="Times New Roman" w:eastAsia="Times New Roman" w:hAnsi="Times New Roman" w:cs="Times New Roman"/>
+          <w:color w:val="EE0000"/>
+          <w:sz w:val="26"/>
+          <w:szCs w:val="26"/>
+        </w:rPr>
+        <w:t>mưa</w:t>
+      </w:r>
+      <w:proofErr w:type="spellEnd"/>
+      <w:r>
+        <w:rPr>
+          <w:rFonts w:ascii="Times New Roman" w:eastAsia="Times New Roman" w:hAnsi="Times New Roman" w:cs="Times New Roman"/>
+          <w:color w:val="EE0000"/>
+          <w:sz w:val="26"/>
+          <w:szCs w:val="26"/>
+        </w:rPr>
+        <w:t xml:space="preserve"> </w:t>
+      </w:r>
+      <w:proofErr w:type="spellStart"/>
+      <w:r>
+        <w:rPr>
+          <w:rFonts w:ascii="Times New Roman" w:eastAsia="Times New Roman" w:hAnsi="Times New Roman" w:cs="Times New Roman"/>
+          <w:color w:val="EE0000"/>
+          <w:sz w:val="26"/>
+          <w:szCs w:val="26"/>
+        </w:rPr>
+        <w:t>rải</w:t>
+      </w:r>
+      <w:proofErr w:type="spellEnd"/>
+      <w:r>
+        <w:rPr>
+          <w:rFonts w:ascii="Times New Roman" w:eastAsia="Times New Roman" w:hAnsi="Times New Roman" w:cs="Times New Roman"/>
+          <w:color w:val="EE0000"/>
+          <w:sz w:val="26"/>
+          <w:szCs w:val="26"/>
+        </w:rPr>
+        <w:t xml:space="preserve"> </w:t>
+      </w:r>
+      <w:proofErr w:type="spellStart"/>
+      <w:r>
+        <w:rPr>
+          <w:rFonts w:ascii="Times New Roman" w:eastAsia="Times New Roman" w:hAnsi="Times New Roman" w:cs="Times New Roman"/>
+          <w:color w:val="EE0000"/>
+          <w:sz w:val="26"/>
+          <w:szCs w:val="26"/>
+        </w:rPr>
+        <w:t>rác</w:t>
+      </w:r>
+      <w:proofErr w:type="spellEnd"/>
+      <w:r>
+        <w:rPr>
+          <w:rFonts w:ascii="Times New Roman" w:eastAsia="Times New Roman" w:hAnsi="Times New Roman" w:cs="Times New Roman"/>
+          <w:color w:val="EE0000"/>
+          <w:sz w:val="26"/>
+          <w:szCs w:val="26"/>
+        </w:rPr>
+        <w:t xml:space="preserve"> </w:t>
+      </w:r>
+      <w:proofErr w:type="spellStart"/>
+      <w:r>
+        <w:rPr>
+          <w:rFonts w:ascii="Times New Roman" w:eastAsia="Times New Roman" w:hAnsi="Times New Roman" w:cs="Times New Roman"/>
+          <w:color w:val="EE0000"/>
+          <w:sz w:val="26"/>
+          <w:szCs w:val="26"/>
+        </w:rPr>
+        <w:t>diện</w:t>
+      </w:r>
+      <w:proofErr w:type="spellEnd"/>
+      <w:r>
+        <w:rPr>
+          <w:rFonts w:ascii="Times New Roman" w:eastAsia="Times New Roman" w:hAnsi="Times New Roman" w:cs="Times New Roman"/>
+          <w:color w:val="EE0000"/>
+          <w:sz w:val="26"/>
+          <w:szCs w:val="26"/>
+        </w:rPr>
+        <w:t xml:space="preserve"> </w:t>
+      </w:r>
+      <w:proofErr w:type="spellStart"/>
+      <w:r>
+        <w:rPr>
+          <w:rFonts w:ascii="Times New Roman" w:eastAsia="Times New Roman" w:hAnsi="Times New Roman" w:cs="Times New Roman"/>
+          <w:color w:val="EE0000"/>
+          <w:sz w:val="26"/>
+          <w:szCs w:val="26"/>
+        </w:rPr>
+        <w:t>rộng</w:t>
+      </w:r>
+      <w:proofErr w:type="spellEnd"/>
+      <w:r>
+        <w:rPr>
+          <w:rFonts w:ascii="Times New Roman" w:eastAsia="Times New Roman" w:hAnsi="Times New Roman" w:cs="Times New Roman"/>
+          <w:color w:val="EE0000"/>
+          <w:sz w:val="26"/>
+          <w:szCs w:val="26"/>
+        </w:rPr>
+        <w:t xml:space="preserve">, </w:t>
+      </w:r>
+      <w:proofErr w:type="spellStart"/>
+      <w:r>
+        <w:rPr>
+          <w:rFonts w:ascii="Times New Roman" w:eastAsia="Times New Roman" w:hAnsi="Times New Roman" w:cs="Times New Roman"/>
+          <w:color w:val="EE0000"/>
+          <w:sz w:val="26"/>
+          <w:szCs w:val="26"/>
+        </w:rPr>
+        <w:t>nếu</w:t>
+      </w:r>
+      <w:proofErr w:type="spellEnd"/>
+      <w:r>
+        <w:rPr>
+          <w:rFonts w:ascii="Times New Roman" w:eastAsia="Times New Roman" w:hAnsi="Times New Roman" w:cs="Times New Roman"/>
+          <w:color w:val="EE0000"/>
+          <w:sz w:val="26"/>
+          <w:szCs w:val="26"/>
+        </w:rPr>
+        <w:t xml:space="preserve"> </w:t>
+      </w:r>
+      <w:proofErr w:type="spellStart"/>
+      <w:r>
+        <w:rPr>
+          <w:rFonts w:ascii="Times New Roman" w:eastAsia="Times New Roman" w:hAnsi="Times New Roman" w:cs="Times New Roman"/>
+          <w:color w:val="EE0000"/>
+          <w:sz w:val="26"/>
+          <w:szCs w:val="26"/>
+        </w:rPr>
+        <w:t>ít</w:t>
+      </w:r>
+      <w:proofErr w:type="spellEnd"/>
+      <w:r>
+        <w:rPr>
+          <w:rFonts w:ascii="Times New Roman" w:eastAsia="Times New Roman" w:hAnsi="Times New Roman" w:cs="Times New Roman"/>
+          <w:color w:val="EE0000"/>
+          <w:sz w:val="26"/>
+          <w:szCs w:val="26"/>
+        </w:rPr>
+        <w:t xml:space="preserve"> </w:t>
+      </w:r>
+      <w:proofErr w:type="spellStart"/>
+      <w:r>
+        <w:rPr>
+          <w:rFonts w:ascii="Times New Roman" w:eastAsia="Times New Roman" w:hAnsi="Times New Roman" w:cs="Times New Roman"/>
+          <w:color w:val="EE0000"/>
+          <w:sz w:val="26"/>
+          <w:szCs w:val="26"/>
+        </w:rPr>
+        <w:t>thì</w:t>
+      </w:r>
+      <w:proofErr w:type="spellEnd"/>
+      <w:r>
+        <w:rPr>
+          <w:rFonts w:ascii="Times New Roman" w:eastAsia="Times New Roman" w:hAnsi="Times New Roman" w:cs="Times New Roman"/>
+          <w:color w:val="EE0000"/>
+          <w:sz w:val="26"/>
+          <w:szCs w:val="26"/>
+        </w:rPr>
+        <w:t xml:space="preserve"> </w:t>
+      </w:r>
+      <w:proofErr w:type="spellStart"/>
+      <w:r>
+        <w:rPr>
+          <w:rFonts w:ascii="Times New Roman" w:eastAsia="Times New Roman" w:hAnsi="Times New Roman" w:cs="Times New Roman"/>
+          <w:color w:val="EE0000"/>
+          <w:sz w:val="26"/>
+          <w:szCs w:val="26"/>
+        </w:rPr>
+        <w:t>nó</w:t>
+      </w:r>
+      <w:proofErr w:type="spellEnd"/>
+      <w:r>
+        <w:rPr>
+          <w:rFonts w:ascii="Times New Roman" w:eastAsia="Times New Roman" w:hAnsi="Times New Roman" w:cs="Times New Roman"/>
+          <w:color w:val="EE0000"/>
+          <w:sz w:val="26"/>
+          <w:szCs w:val="26"/>
+        </w:rPr>
+        <w:t xml:space="preserve"> </w:t>
+      </w:r>
+      <w:proofErr w:type="spellStart"/>
+      <w:r>
+        <w:rPr>
+          <w:rFonts w:ascii="Times New Roman" w:eastAsia="Times New Roman" w:hAnsi="Times New Roman" w:cs="Times New Roman"/>
+          <w:color w:val="EE0000"/>
+          <w:sz w:val="26"/>
+          <w:szCs w:val="26"/>
+        </w:rPr>
+        <w:t>ghi</w:t>
+      </w:r>
+      <w:proofErr w:type="spellEnd"/>
+      <w:r>
+        <w:rPr>
+          <w:rFonts w:ascii="Times New Roman" w:eastAsia="Times New Roman" w:hAnsi="Times New Roman" w:cs="Times New Roman"/>
+          <w:color w:val="EE0000"/>
+          <w:sz w:val="26"/>
+          <w:szCs w:val="26"/>
+        </w:rPr>
+        <w:t xml:space="preserve"> </w:t>
+      </w:r>
+      <w:proofErr w:type="spellStart"/>
+      <w:r>
+        <w:rPr>
+          <w:rFonts w:ascii="Times New Roman" w:eastAsia="Times New Roman" w:hAnsi="Times New Roman" w:cs="Times New Roman"/>
+          <w:color w:val="EE0000"/>
+          <w:sz w:val="26"/>
+          <w:szCs w:val="26"/>
+        </w:rPr>
+        <w:t>mưa</w:t>
+      </w:r>
+      <w:proofErr w:type="spellEnd"/>
+      <w:r>
+        <w:rPr>
+          <w:rFonts w:ascii="Times New Roman" w:eastAsia="Times New Roman" w:hAnsi="Times New Roman" w:cs="Times New Roman"/>
+          <w:color w:val="EE0000"/>
+          <w:sz w:val="26"/>
+          <w:szCs w:val="26"/>
+        </w:rPr>
+        <w:t xml:space="preserve"> </w:t>
+      </w:r>
+      <w:proofErr w:type="spellStart"/>
+      <w:r>
+        <w:rPr>
+          <w:rFonts w:ascii="Times New Roman" w:eastAsia="Times New Roman" w:hAnsi="Times New Roman" w:cs="Times New Roman"/>
+          <w:color w:val="EE0000"/>
+          <w:sz w:val="26"/>
+          <w:szCs w:val="26"/>
+        </w:rPr>
+        <w:t>vùng</w:t>
+      </w:r>
+      <w:proofErr w:type="spellEnd"/>
+      <w:r>
+        <w:rPr>
+          <w:rFonts w:ascii="Times New Roman" w:eastAsia="Times New Roman" w:hAnsi="Times New Roman" w:cs="Times New Roman"/>
+          <w:color w:val="EE0000"/>
+          <w:sz w:val="26"/>
+          <w:szCs w:val="26"/>
+        </w:rPr>
+        <w:t xml:space="preserve">….., </w:t>
+      </w:r>
+      <w:proofErr w:type="spellStart"/>
+      <w:r>
+        <w:rPr>
+          <w:rFonts w:ascii="Times New Roman" w:eastAsia="Times New Roman" w:hAnsi="Times New Roman" w:cs="Times New Roman"/>
+          <w:color w:val="EE0000"/>
+          <w:sz w:val="26"/>
+          <w:szCs w:val="26"/>
+        </w:rPr>
+        <w:t>tự</w:t>
+      </w:r>
+      <w:proofErr w:type="spellEnd"/>
+      <w:r>
+        <w:rPr>
+          <w:rFonts w:ascii="Times New Roman" w:eastAsia="Times New Roman" w:hAnsi="Times New Roman" w:cs="Times New Roman"/>
+          <w:color w:val="EE0000"/>
+          <w:sz w:val="26"/>
+          <w:szCs w:val="26"/>
+        </w:rPr>
+        <w:t xml:space="preserve"> </w:t>
+      </w:r>
+      <w:proofErr w:type="spellStart"/>
+      <w:r>
+        <w:rPr>
+          <w:rFonts w:ascii="Times New Roman" w:eastAsia="Times New Roman" w:hAnsi="Times New Roman" w:cs="Times New Roman"/>
+          <w:color w:val="EE0000"/>
+          <w:sz w:val="26"/>
+          <w:szCs w:val="26"/>
+        </w:rPr>
+        <w:t>nó</w:t>
+      </w:r>
+      <w:proofErr w:type="spellEnd"/>
+      <w:r>
+        <w:rPr>
+          <w:rFonts w:ascii="Times New Roman" w:eastAsia="Times New Roman" w:hAnsi="Times New Roman" w:cs="Times New Roman"/>
+          <w:color w:val="EE0000"/>
+          <w:sz w:val="26"/>
+          <w:szCs w:val="26"/>
+        </w:rPr>
+        <w:t xml:space="preserve"> </w:t>
+      </w:r>
+      <w:proofErr w:type="spellStart"/>
+      <w:r>
+        <w:rPr>
+          <w:rFonts w:ascii="Times New Roman" w:eastAsia="Times New Roman" w:hAnsi="Times New Roman" w:cs="Times New Roman"/>
+          <w:color w:val="EE0000"/>
+          <w:sz w:val="26"/>
+          <w:szCs w:val="26"/>
+        </w:rPr>
+        <w:t>phân</w:t>
+      </w:r>
+      <w:proofErr w:type="spellEnd"/>
+      <w:r>
+        <w:rPr>
+          <w:rFonts w:ascii="Times New Roman" w:eastAsia="Times New Roman" w:hAnsi="Times New Roman" w:cs="Times New Roman"/>
+          <w:color w:val="EE0000"/>
+          <w:sz w:val="26"/>
+          <w:szCs w:val="26"/>
+        </w:rPr>
+        <w:t xml:space="preserve"> </w:t>
+      </w:r>
+      <w:proofErr w:type="spellStart"/>
+      <w:r>
+        <w:rPr>
+          <w:rFonts w:ascii="Times New Roman" w:eastAsia="Times New Roman" w:hAnsi="Times New Roman" w:cs="Times New Roman"/>
+          <w:color w:val="EE0000"/>
+          <w:sz w:val="26"/>
+          <w:szCs w:val="26"/>
+        </w:rPr>
+        <w:t>bổ</w:t>
+      </w:r>
+      <w:proofErr w:type="spellEnd"/>
+      <w:r>
+        <w:rPr>
+          <w:rFonts w:ascii="Times New Roman" w:eastAsia="Times New Roman" w:hAnsi="Times New Roman" w:cs="Times New Roman"/>
+          <w:color w:val="EE0000"/>
           <w:sz w:val="26"/>
           <w:szCs w:val="26"/>
           <w:lang w:val="vi-VN"/>
         </w:rPr>
-        <w:t>_start</w:t>
-      </w:r>
-      <w:r>
-        <w:rPr>
-          <w:rFonts w:ascii="Times New Roman" w:eastAsia="Times New Roman" w:hAnsi="Times New Roman" w:cs="Times New Roman"/>
-          <w:sz w:val="26"/>
-          <w:szCs w:val="26"/>
-        </w:rPr>
-        <w:t>}</w:t>
-      </w:r>
-      <w:proofErr w:type="spellStart"/>
-      <w:r>
-        <w:rPr>
-          <w:rFonts w:ascii="Times New Roman" w:eastAsia="Times New Roman" w:hAnsi="Times New Roman" w:cs="Times New Roman"/>
-          <w:color w:val="000000" w:themeColor="text1"/>
-          <w:sz w:val="26"/>
-          <w:szCs w:val="26"/>
-          <w:highlight w:val="yellow"/>
-        </w:rPr>
-        <w:t>ảnh</w:t>
-      </w:r>
-      <w:proofErr w:type="spellEnd"/>
-      <w:r>
-        <w:rPr>
-          <w:rFonts w:ascii="Times New Roman" w:eastAsia="Times New Roman" w:hAnsi="Times New Roman" w:cs="Times New Roman"/>
-          <w:color w:val="000000" w:themeColor="text1"/>
-          <w:sz w:val="26"/>
-          <w:szCs w:val="26"/>
-          <w:highlight w:val="yellow"/>
-        </w:rPr>
-        <w:t xml:space="preserve"> </w:t>
-      </w:r>
-      <w:proofErr w:type="spellStart"/>
-      <w:r>
-        <w:rPr>
-          <w:rFonts w:ascii="Times New Roman" w:eastAsia="Times New Roman" w:hAnsi="Times New Roman" w:cs="Times New Roman"/>
-          <w:color w:val="000000" w:themeColor="text1"/>
-          <w:sz w:val="26"/>
-          <w:szCs w:val="26"/>
-          <w:highlight w:val="yellow"/>
-        </w:rPr>
-        <w:t>hưởng</w:t>
-      </w:r>
-      <w:proofErr w:type="spellEnd"/>
-      <w:r>
-        <w:rPr>
-          <w:rFonts w:ascii="Times New Roman" w:eastAsia="Times New Roman" w:hAnsi="Times New Roman" w:cs="Times New Roman"/>
-          <w:color w:val="000000" w:themeColor="text1"/>
-          <w:sz w:val="26"/>
-          <w:szCs w:val="26"/>
-          <w:highlight w:val="yellow"/>
-        </w:rPr>
-        <w:t xml:space="preserve"> </w:t>
-      </w:r>
-      <w:proofErr w:type="spellStart"/>
-      <w:r>
-        <w:rPr>
-          <w:rFonts w:ascii="Times New Roman" w:eastAsia="Times New Roman" w:hAnsi="Times New Roman" w:cs="Times New Roman"/>
-          <w:color w:val="000000" w:themeColor="text1"/>
-          <w:sz w:val="26"/>
-          <w:szCs w:val="26"/>
-          <w:highlight w:val="yellow"/>
-        </w:rPr>
-        <w:t>của</w:t>
-      </w:r>
-      <w:proofErr w:type="spellEnd"/>
-      <w:r>
-        <w:rPr>
-          <w:rFonts w:ascii="Times New Roman" w:eastAsia="Times New Roman" w:hAnsi="Times New Roman" w:cs="Times New Roman"/>
-          <w:sz w:val="26"/>
-          <w:szCs w:val="26"/>
-          <w:highlight w:val="yellow"/>
-        </w:rPr>
-        <w:t xml:space="preserve"> do </w:t>
-      </w:r>
-      <w:proofErr w:type="spellStart"/>
-      <w:r>
-        <w:rPr>
-          <w:rFonts w:ascii="Times New Roman" w:eastAsia="Times New Roman" w:hAnsi="Times New Roman" w:cs="Times New Roman"/>
-          <w:sz w:val="26"/>
-          <w:szCs w:val="26"/>
-          <w:highlight w:val="yellow"/>
-        </w:rPr>
-        <w:t>ảnh</w:t>
-      </w:r>
-      <w:proofErr w:type="spellEnd"/>
-      <w:r>
-        <w:rPr>
-          <w:rFonts w:ascii="Times New Roman" w:eastAsia="Times New Roman" w:hAnsi="Times New Roman" w:cs="Times New Roman"/>
-          <w:sz w:val="26"/>
-          <w:szCs w:val="26"/>
-          <w:highlight w:val="yellow"/>
-        </w:rPr>
-        <w:t xml:space="preserve"> </w:t>
-      </w:r>
-      <w:proofErr w:type="spellStart"/>
-      <w:r>
-        <w:rPr>
-          <w:rFonts w:ascii="Times New Roman" w:eastAsia="Times New Roman" w:hAnsi="Times New Roman" w:cs="Times New Roman"/>
-          <w:sz w:val="26"/>
-          <w:szCs w:val="26"/>
-          <w:highlight w:val="yellow"/>
-        </w:rPr>
-        <w:t>hưởng</w:t>
-      </w:r>
-      <w:proofErr w:type="spellEnd"/>
-      <w:r>
-        <w:rPr>
-          <w:rFonts w:ascii="Times New Roman" w:eastAsia="Times New Roman" w:hAnsi="Times New Roman" w:cs="Times New Roman"/>
-          <w:sz w:val="26"/>
-          <w:szCs w:val="26"/>
-          <w:highlight w:val="yellow"/>
-        </w:rPr>
-        <w:t xml:space="preserve"> </w:t>
-      </w:r>
-      <w:proofErr w:type="spellStart"/>
-      <w:r>
-        <w:rPr>
-          <w:rFonts w:ascii="Times New Roman" w:eastAsia="Times New Roman" w:hAnsi="Times New Roman" w:cs="Times New Roman"/>
-          <w:sz w:val="26"/>
-          <w:szCs w:val="26"/>
-          <w:highlight w:val="yellow"/>
-        </w:rPr>
-        <w:t>của</w:t>
-      </w:r>
-      <w:proofErr w:type="spellEnd"/>
-      <w:r>
-        <w:rPr>
-          <w:rFonts w:ascii="Times New Roman" w:eastAsia="Times New Roman" w:hAnsi="Times New Roman" w:cs="Times New Roman"/>
-          <w:sz w:val="26"/>
-          <w:szCs w:val="26"/>
-          <w:highlight w:val="yellow"/>
-        </w:rPr>
-        <w:t xml:space="preserve"> </w:t>
-      </w:r>
-      <w:proofErr w:type="spellStart"/>
-      <w:r>
-        <w:rPr>
-          <w:rFonts w:ascii="Times New Roman" w:eastAsia="Times New Roman" w:hAnsi="Times New Roman" w:cs="Times New Roman"/>
-          <w:sz w:val="26"/>
-          <w:szCs w:val="26"/>
-          <w:highlight w:val="yellow"/>
-        </w:rPr>
-        <w:t>vùng</w:t>
-      </w:r>
-      <w:proofErr w:type="spellEnd"/>
-      <w:r>
-        <w:rPr>
-          <w:rFonts w:ascii="Times New Roman" w:eastAsia="Times New Roman" w:hAnsi="Times New Roman" w:cs="Times New Roman"/>
-          <w:sz w:val="26"/>
-          <w:szCs w:val="26"/>
-          <w:highlight w:val="yellow"/>
-        </w:rPr>
-        <w:t xml:space="preserve"> </w:t>
-      </w:r>
-      <w:proofErr w:type="spellStart"/>
-      <w:r>
-        <w:rPr>
-          <w:rFonts w:ascii="Times New Roman" w:eastAsia="Times New Roman" w:hAnsi="Times New Roman" w:cs="Times New Roman"/>
-          <w:sz w:val="26"/>
-          <w:szCs w:val="26"/>
-          <w:highlight w:val="yellow"/>
-        </w:rPr>
-        <w:t>mây</w:t>
-      </w:r>
-      <w:proofErr w:type="spellEnd"/>
-      <w:r>
-        <w:rPr>
-          <w:rFonts w:ascii="Times New Roman" w:eastAsia="Times New Roman" w:hAnsi="Times New Roman" w:cs="Times New Roman"/>
-          <w:sz w:val="26"/>
-          <w:szCs w:val="26"/>
-          <w:highlight w:val="yellow"/>
-        </w:rPr>
-        <w:t xml:space="preserve"> </w:t>
-      </w:r>
-      <w:proofErr w:type="spellStart"/>
-      <w:r>
-        <w:rPr>
-          <w:rFonts w:ascii="Times New Roman" w:eastAsia="Times New Roman" w:hAnsi="Times New Roman" w:cs="Times New Roman"/>
-          <w:sz w:val="26"/>
-          <w:szCs w:val="26"/>
-          <w:highlight w:val="yellow"/>
-        </w:rPr>
-        <w:t>đối</w:t>
-      </w:r>
-      <w:proofErr w:type="spellEnd"/>
-      <w:r>
-        <w:rPr>
-          <w:rFonts w:ascii="Times New Roman" w:eastAsia="Times New Roman" w:hAnsi="Times New Roman" w:cs="Times New Roman"/>
-          <w:sz w:val="26"/>
-          <w:szCs w:val="26"/>
-          <w:highlight w:val="yellow"/>
-        </w:rPr>
-        <w:t xml:space="preserve"> </w:t>
-      </w:r>
-      <w:proofErr w:type="spellStart"/>
-      <w:r>
-        <w:rPr>
-          <w:rFonts w:ascii="Times New Roman" w:eastAsia="Times New Roman" w:hAnsi="Times New Roman" w:cs="Times New Roman"/>
-          <w:sz w:val="26"/>
-          <w:szCs w:val="26"/>
-          <w:highlight w:val="yellow"/>
-        </w:rPr>
-        <w:t>lưu</w:t>
-      </w:r>
-      <w:proofErr w:type="spellEnd"/>
-      <w:r>
-        <w:rPr>
-          <w:rFonts w:ascii="Times New Roman" w:eastAsia="Times New Roman" w:hAnsi="Times New Roman" w:cs="Times New Roman"/>
-          <w:sz w:val="26"/>
-          <w:szCs w:val="26"/>
-        </w:rPr>
-        <w:t xml:space="preserve"> </w:t>
-      </w:r>
-      <w:r>
-        <w:rPr>
-          <w:rFonts w:ascii="Times New Roman" w:eastAsia="Times New Roman" w:hAnsi="Times New Roman" w:cs="Times New Roman"/>
-          <w:sz w:val="26"/>
-          <w:szCs w:val="26"/>
-          <w:highlight w:val="yellow"/>
-        </w:rPr>
-        <w:t>(</w:t>
-      </w:r>
-      <w:proofErr w:type="spellStart"/>
-      <w:r>
-        <w:rPr>
-          <w:rFonts w:ascii="Times New Roman" w:eastAsia="Times New Roman" w:hAnsi="Times New Roman" w:cs="Times New Roman"/>
-          <w:sz w:val="26"/>
-          <w:szCs w:val="26"/>
-          <w:highlight w:val="yellow"/>
-        </w:rPr>
-        <w:t>lấy</w:t>
-      </w:r>
-      <w:proofErr w:type="spellEnd"/>
-      <w:r>
-        <w:rPr>
-          <w:rFonts w:ascii="Times New Roman" w:eastAsia="Times New Roman" w:hAnsi="Times New Roman" w:cs="Times New Roman"/>
-          <w:sz w:val="26"/>
-          <w:szCs w:val="26"/>
-          <w:highlight w:val="yellow"/>
-        </w:rPr>
-        <w:t xml:space="preserve"> </w:t>
-      </w:r>
-      <w:proofErr w:type="spellStart"/>
-      <w:r>
-        <w:rPr>
-          <w:rFonts w:ascii="Times New Roman" w:eastAsia="Times New Roman" w:hAnsi="Times New Roman" w:cs="Times New Roman"/>
-          <w:sz w:val="26"/>
-          <w:szCs w:val="26"/>
-          <w:highlight w:val="yellow"/>
-        </w:rPr>
-        <w:t>thông</w:t>
-      </w:r>
-      <w:proofErr w:type="spellEnd"/>
-      <w:r>
-        <w:rPr>
-          <w:rFonts w:ascii="Times New Roman" w:eastAsia="Times New Roman" w:hAnsi="Times New Roman" w:cs="Times New Roman"/>
-          <w:sz w:val="26"/>
-          <w:szCs w:val="26"/>
-          <w:highlight w:val="yellow"/>
-        </w:rPr>
-        <w:t xml:space="preserve"> tin </w:t>
-      </w:r>
-      <w:proofErr w:type="spellStart"/>
-      <w:r>
-        <w:rPr>
-          <w:rFonts w:ascii="Times New Roman" w:eastAsia="Times New Roman" w:hAnsi="Times New Roman" w:cs="Times New Roman"/>
-          <w:sz w:val="26"/>
-          <w:szCs w:val="26"/>
-          <w:highlight w:val="yellow"/>
-        </w:rPr>
-        <w:t>trên</w:t>
-      </w:r>
-      <w:proofErr w:type="spellEnd"/>
-      <w:r>
-        <w:rPr>
-          <w:rFonts w:ascii="Times New Roman" w:eastAsia="Times New Roman" w:hAnsi="Times New Roman" w:cs="Times New Roman"/>
-          <w:sz w:val="26"/>
-          <w:szCs w:val="26"/>
-          <w:highlight w:val="yellow"/>
-        </w:rPr>
-        <w:t xml:space="preserve"> </w:t>
-      </w:r>
-      <w:proofErr w:type="spellStart"/>
-      <w:r>
-        <w:rPr>
-          <w:rFonts w:ascii="Times New Roman" w:eastAsia="Times New Roman" w:hAnsi="Times New Roman" w:cs="Times New Roman"/>
-          <w:sz w:val="26"/>
-          <w:szCs w:val="26"/>
-          <w:highlight w:val="yellow"/>
-        </w:rPr>
-        <w:t>bản</w:t>
-      </w:r>
-      <w:proofErr w:type="spellEnd"/>
-      <w:r>
-        <w:rPr>
-          <w:rFonts w:ascii="Times New Roman" w:eastAsia="Times New Roman" w:hAnsi="Times New Roman" w:cs="Times New Roman"/>
-          <w:sz w:val="26"/>
-          <w:szCs w:val="26"/>
-          <w:highlight w:val="yellow"/>
-        </w:rPr>
-        <w:t xml:space="preserve"> tin </w:t>
-      </w:r>
-      <w:proofErr w:type="spellStart"/>
-      <w:r>
-        <w:rPr>
-          <w:rFonts w:ascii="Times New Roman" w:eastAsia="Times New Roman" w:hAnsi="Times New Roman" w:cs="Times New Roman"/>
-          <w:sz w:val="26"/>
-          <w:szCs w:val="26"/>
-          <w:highlight w:val="yellow"/>
-        </w:rPr>
-        <w:t>cảnh</w:t>
-      </w:r>
-      <w:proofErr w:type="spellEnd"/>
-      <w:r>
-        <w:rPr>
-          <w:rFonts w:ascii="Times New Roman" w:eastAsia="Times New Roman" w:hAnsi="Times New Roman" w:cs="Times New Roman"/>
-          <w:sz w:val="26"/>
-          <w:szCs w:val="26"/>
-          <w:highlight w:val="yellow"/>
-        </w:rPr>
-        <w:t xml:space="preserve"> </w:t>
-      </w:r>
-      <w:proofErr w:type="spellStart"/>
-      <w:r>
-        <w:rPr>
-          <w:rFonts w:ascii="Times New Roman" w:eastAsia="Times New Roman" w:hAnsi="Times New Roman" w:cs="Times New Roman"/>
-          <w:sz w:val="26"/>
-          <w:szCs w:val="26"/>
-          <w:highlight w:val="yellow"/>
-        </w:rPr>
-        <w:t>báo</w:t>
-      </w:r>
-      <w:proofErr w:type="spellEnd"/>
-      <w:r>
-        <w:rPr>
-          <w:rFonts w:ascii="Times New Roman" w:eastAsia="Times New Roman" w:hAnsi="Times New Roman" w:cs="Times New Roman"/>
-          <w:sz w:val="26"/>
-          <w:szCs w:val="26"/>
-          <w:highlight w:val="yellow"/>
-        </w:rPr>
-        <w:t xml:space="preserve"> </w:t>
-      </w:r>
-      <w:proofErr w:type="spellStart"/>
-      <w:r>
-        <w:rPr>
-          <w:rFonts w:ascii="Times New Roman" w:eastAsia="Times New Roman" w:hAnsi="Times New Roman" w:cs="Times New Roman"/>
-          <w:sz w:val="26"/>
-          <w:szCs w:val="26"/>
-          <w:highlight w:val="yellow"/>
-        </w:rPr>
-        <w:t>của</w:t>
-      </w:r>
-      <w:proofErr w:type="spellEnd"/>
-      <w:r>
-        <w:rPr>
-          <w:rFonts w:ascii="Times New Roman" w:eastAsia="Times New Roman" w:hAnsi="Times New Roman" w:cs="Times New Roman"/>
-          <w:sz w:val="26"/>
-          <w:szCs w:val="26"/>
-          <w:highlight w:val="yellow"/>
-        </w:rPr>
-        <w:t xml:space="preserve"> </w:t>
-      </w:r>
-      <w:proofErr w:type="spellStart"/>
-      <w:r>
-        <w:rPr>
-          <w:rFonts w:ascii="Times New Roman" w:eastAsia="Times New Roman" w:hAnsi="Times New Roman" w:cs="Times New Roman"/>
-          <w:sz w:val="26"/>
-          <w:szCs w:val="26"/>
-          <w:highlight w:val="yellow"/>
-        </w:rPr>
-        <w:t>khí</w:t>
-      </w:r>
-      <w:proofErr w:type="spellEnd"/>
-      <w:r>
-        <w:rPr>
-          <w:rFonts w:ascii="Times New Roman" w:eastAsia="Times New Roman" w:hAnsi="Times New Roman" w:cs="Times New Roman"/>
-          <w:sz w:val="26"/>
-          <w:szCs w:val="26"/>
-          <w:highlight w:val="yellow"/>
-        </w:rPr>
-        <w:t xml:space="preserve"> </w:t>
-      </w:r>
-      <w:proofErr w:type="spellStart"/>
-      <w:r>
-        <w:rPr>
-          <w:rFonts w:ascii="Times New Roman" w:eastAsia="Times New Roman" w:hAnsi="Times New Roman" w:cs="Times New Roman"/>
-          <w:sz w:val="26"/>
-          <w:szCs w:val="26"/>
-          <w:highlight w:val="yellow"/>
-        </w:rPr>
-        <w:t>tượng</w:t>
-      </w:r>
-      <w:proofErr w:type="spellEnd"/>
-      <w:r>
-        <w:rPr>
-          <w:rFonts w:ascii="Times New Roman" w:eastAsia="Times New Roman" w:hAnsi="Times New Roman" w:cs="Times New Roman"/>
-          <w:sz w:val="26"/>
-          <w:szCs w:val="26"/>
-          <w:highlight w:val="yellow"/>
-        </w:rPr>
-        <w:t xml:space="preserve"> </w:t>
-      </w:r>
-      <w:proofErr w:type="spellStart"/>
-      <w:r>
-        <w:rPr>
-          <w:rFonts w:ascii="Times New Roman" w:eastAsia="Times New Roman" w:hAnsi="Times New Roman" w:cs="Times New Roman"/>
-          <w:sz w:val="26"/>
-          <w:szCs w:val="26"/>
-          <w:highlight w:val="yellow"/>
-        </w:rPr>
-        <w:t>thuỷ</w:t>
-      </w:r>
-      <w:proofErr w:type="spellEnd"/>
-      <w:r>
-        <w:rPr>
-          <w:rFonts w:ascii="Times New Roman" w:eastAsia="Times New Roman" w:hAnsi="Times New Roman" w:cs="Times New Roman"/>
-          <w:sz w:val="26"/>
-          <w:szCs w:val="26"/>
-          <w:highlight w:val="yellow"/>
-        </w:rPr>
-        <w:t xml:space="preserve"> </w:t>
-      </w:r>
-      <w:proofErr w:type="spellStart"/>
-      <w:r>
-        <w:rPr>
-          <w:rFonts w:ascii="Times New Roman" w:eastAsia="Times New Roman" w:hAnsi="Times New Roman" w:cs="Times New Roman"/>
-          <w:sz w:val="26"/>
-          <w:szCs w:val="26"/>
-          <w:highlight w:val="yellow"/>
-        </w:rPr>
-        <w:t>văn</w:t>
-      </w:r>
-      <w:proofErr w:type="spellEnd"/>
-      <w:r>
-        <w:rPr>
-          <w:rFonts w:ascii="Times New Roman" w:eastAsia="Times New Roman" w:hAnsi="Times New Roman" w:cs="Times New Roman"/>
-          <w:sz w:val="26"/>
-          <w:szCs w:val="26"/>
-          <w:highlight w:val="yellow"/>
-        </w:rPr>
-        <w:t xml:space="preserve"> </w:t>
-      </w:r>
-      <w:proofErr w:type="spellStart"/>
-      <w:r>
-        <w:rPr>
-          <w:rFonts w:ascii="Times New Roman" w:eastAsia="Times New Roman" w:hAnsi="Times New Roman" w:cs="Times New Roman"/>
-          <w:sz w:val="26"/>
-          <w:szCs w:val="26"/>
-          <w:highlight w:val="yellow"/>
-        </w:rPr>
-        <w:t>đồng</w:t>
-      </w:r>
-      <w:proofErr w:type="spellEnd"/>
-      <w:r>
-        <w:rPr>
-          <w:rFonts w:ascii="Times New Roman" w:eastAsia="Times New Roman" w:hAnsi="Times New Roman" w:cs="Times New Roman"/>
-          <w:sz w:val="26"/>
-          <w:szCs w:val="26"/>
-          <w:highlight w:val="yellow"/>
-        </w:rPr>
-        <w:t xml:space="preserve"> </w:t>
-      </w:r>
-      <w:proofErr w:type="spellStart"/>
-      <w:r>
-        <w:rPr>
-          <w:rFonts w:ascii="Times New Roman" w:eastAsia="Times New Roman" w:hAnsi="Times New Roman" w:cs="Times New Roman"/>
-          <w:sz w:val="26"/>
-          <w:szCs w:val="26"/>
-          <w:highlight w:val="yellow"/>
-        </w:rPr>
-        <w:t>bằng</w:t>
-      </w:r>
-      <w:proofErr w:type="spellEnd"/>
-      <w:r>
-        <w:rPr>
-          <w:rFonts w:ascii="Times New Roman" w:eastAsia="Times New Roman" w:hAnsi="Times New Roman" w:cs="Times New Roman"/>
-          <w:sz w:val="26"/>
-          <w:szCs w:val="26"/>
-          <w:highlight w:val="yellow"/>
-        </w:rPr>
-        <w:t xml:space="preserve"> </w:t>
-      </w:r>
-      <w:proofErr w:type="spellStart"/>
-      <w:r>
-        <w:rPr>
-          <w:rFonts w:ascii="Times New Roman" w:eastAsia="Times New Roman" w:hAnsi="Times New Roman" w:cs="Times New Roman"/>
-          <w:sz w:val="26"/>
-          <w:szCs w:val="26"/>
-          <w:highlight w:val="yellow"/>
-        </w:rPr>
-        <w:t>bắc</w:t>
-      </w:r>
-      <w:proofErr w:type="spellEnd"/>
-      <w:r>
-        <w:rPr>
-          <w:rFonts w:ascii="Times New Roman" w:eastAsia="Times New Roman" w:hAnsi="Times New Roman" w:cs="Times New Roman"/>
-          <w:sz w:val="26"/>
-          <w:szCs w:val="26"/>
-          <w:highlight w:val="yellow"/>
-        </w:rPr>
-        <w:t xml:space="preserve"> </w:t>
-      </w:r>
-      <w:proofErr w:type="spellStart"/>
-      <w:r>
-        <w:rPr>
-          <w:rFonts w:ascii="Times New Roman" w:eastAsia="Times New Roman" w:hAnsi="Times New Roman" w:cs="Times New Roman"/>
-          <w:sz w:val="26"/>
-          <w:szCs w:val="26"/>
-          <w:highlight w:val="yellow"/>
-        </w:rPr>
-        <w:t>bộ</w:t>
-      </w:r>
-      <w:proofErr w:type="spellEnd"/>
-      <w:r>
-        <w:rPr>
-          <w:rFonts w:ascii="Times New Roman" w:eastAsia="Times New Roman" w:hAnsi="Times New Roman" w:cs="Times New Roman"/>
-          <w:sz w:val="26"/>
-          <w:szCs w:val="26"/>
-          <w:highlight w:val="yellow"/>
-        </w:rPr>
-        <w:t xml:space="preserve"> email </w:t>
-      </w:r>
-      <w:proofErr w:type="spellStart"/>
-      <w:r>
-        <w:rPr>
-          <w:rFonts w:ascii="Times New Roman" w:eastAsia="Times New Roman" w:hAnsi="Times New Roman" w:cs="Times New Roman"/>
-          <w:sz w:val="26"/>
-          <w:szCs w:val="26"/>
-          <w:highlight w:val="yellow"/>
-        </w:rPr>
-        <w:t>hoặc</w:t>
-      </w:r>
-      <w:proofErr w:type="spellEnd"/>
-      <w:r>
-        <w:rPr>
-          <w:rFonts w:ascii="Times New Roman" w:eastAsia="Times New Roman" w:hAnsi="Times New Roman" w:cs="Times New Roman"/>
-          <w:sz w:val="26"/>
-          <w:szCs w:val="26"/>
-          <w:highlight w:val="yellow"/>
-        </w:rPr>
-        <w:t xml:space="preserve"> website)</w:t>
-      </w:r>
-      <w:r>
-        <w:rPr>
-          <w:rFonts w:ascii="Times New Roman" w:eastAsia="Times New Roman" w:hAnsi="Times New Roman" w:cs="Times New Roman"/>
-          <w:sz w:val="26"/>
-          <w:szCs w:val="26"/>
-        </w:rPr>
-        <w:t xml:space="preserve"> </w:t>
-      </w:r>
-      <w:proofErr w:type="spellStart"/>
-      <w:r>
-        <w:rPr>
-          <w:rFonts w:ascii="Times New Roman" w:eastAsia="Times New Roman" w:hAnsi="Times New Roman" w:cs="Times New Roman"/>
-          <w:sz w:val="26"/>
-          <w:szCs w:val="26"/>
-        </w:rPr>
-        <w:t>địa</w:t>
-      </w:r>
-      <w:proofErr w:type="spellEnd"/>
-      <w:r>
-        <w:rPr>
-          <w:rFonts w:ascii="Times New Roman" w:eastAsia="Times New Roman" w:hAnsi="Times New Roman" w:cs="Times New Roman"/>
-          <w:sz w:val="26"/>
-          <w:szCs w:val="26"/>
-        </w:rPr>
-        <w:t xml:space="preserve"> </w:t>
-      </w:r>
-      <w:proofErr w:type="spellStart"/>
-      <w:r>
-        <w:rPr>
-          <w:rFonts w:ascii="Times New Roman" w:eastAsia="Times New Roman" w:hAnsi="Times New Roman" w:cs="Times New Roman"/>
-          <w:sz w:val="26"/>
-          <w:szCs w:val="26"/>
-        </w:rPr>
-        <w:t>bàn</w:t>
-      </w:r>
-      <w:proofErr w:type="spellEnd"/>
-      <w:r>
-        <w:rPr>
-          <w:rFonts w:ascii="Times New Roman" w:eastAsia="Times New Roman" w:hAnsi="Times New Roman" w:cs="Times New Roman"/>
-          <w:sz w:val="26"/>
-          <w:szCs w:val="26"/>
-        </w:rPr>
-        <w:t xml:space="preserve"> Thành </w:t>
-      </w:r>
-      <w:proofErr w:type="spellStart"/>
-      <w:r>
-        <w:rPr>
-          <w:rFonts w:ascii="Times New Roman" w:eastAsia="Times New Roman" w:hAnsi="Times New Roman" w:cs="Times New Roman"/>
-          <w:sz w:val="26"/>
-          <w:szCs w:val="26"/>
-        </w:rPr>
-        <w:t>phố</w:t>
-      </w:r>
-      <w:proofErr w:type="spellEnd"/>
-      <w:r>
-        <w:rPr>
-          <w:rFonts w:ascii="Times New Roman" w:eastAsia="Times New Roman" w:hAnsi="Times New Roman" w:cs="Times New Roman"/>
-          <w:sz w:val="26"/>
-          <w:szCs w:val="26"/>
-        </w:rPr>
-        <w:t xml:space="preserve"> </w:t>
-      </w:r>
-      <w:proofErr w:type="spellStart"/>
-      <w:r>
-        <w:rPr>
-          <w:rFonts w:ascii="Times New Roman" w:eastAsia="Times New Roman" w:hAnsi="Times New Roman" w:cs="Times New Roman"/>
-          <w:sz w:val="26"/>
-          <w:szCs w:val="26"/>
-        </w:rPr>
-        <w:t>có</w:t>
-      </w:r>
-      <w:proofErr w:type="spellEnd"/>
-      <w:r>
-        <w:rPr>
-          <w:rFonts w:ascii="Times New Roman" w:eastAsia="Times New Roman" w:hAnsi="Times New Roman" w:cs="Times New Roman"/>
-          <w:sz w:val="26"/>
-          <w:szCs w:val="26"/>
-        </w:rPr>
-        <w:t xml:space="preserve"> </w:t>
-      </w:r>
-      <w:proofErr w:type="spellStart"/>
-      <w:r>
-        <w:rPr>
-          <w:rFonts w:ascii="Times New Roman" w:eastAsia="Times New Roman" w:hAnsi="Times New Roman" w:cs="Times New Roman"/>
-          <w:color w:val="EE0000"/>
-          <w:sz w:val="26"/>
-          <w:szCs w:val="26"/>
-        </w:rPr>
-        <w:t>Mưa</w:t>
-      </w:r>
-      <w:proofErr w:type="spellEnd"/>
-      <w:r>
-        <w:rPr>
-          <w:rFonts w:ascii="Times New Roman" w:eastAsia="Times New Roman" w:hAnsi="Times New Roman" w:cs="Times New Roman"/>
-          <w:color w:val="EE0000"/>
-          <w:sz w:val="26"/>
-          <w:szCs w:val="26"/>
-        </w:rPr>
-        <w:t xml:space="preserve"> </w:t>
-      </w:r>
-      <w:proofErr w:type="spellStart"/>
-      <w:r>
-        <w:rPr>
-          <w:rFonts w:ascii="Times New Roman" w:eastAsia="Times New Roman" w:hAnsi="Times New Roman" w:cs="Times New Roman"/>
-          <w:color w:val="EE0000"/>
-          <w:sz w:val="26"/>
-          <w:szCs w:val="26"/>
-          <w:highlight w:val="yellow"/>
-        </w:rPr>
-        <w:t>nhỏ</w:t>
-      </w:r>
-      <w:proofErr w:type="spellEnd"/>
-      <w:r>
-        <w:rPr>
-          <w:rFonts w:ascii="Times New Roman" w:eastAsia="Times New Roman" w:hAnsi="Times New Roman" w:cs="Times New Roman"/>
-          <w:color w:val="EE0000"/>
-          <w:sz w:val="26"/>
-          <w:szCs w:val="26"/>
-          <w:highlight w:val="yellow"/>
-        </w:rPr>
-        <w:t xml:space="preserve"> </w:t>
-      </w:r>
-      <w:proofErr w:type="spellStart"/>
-      <w:r>
-        <w:rPr>
-          <w:rFonts w:ascii="Times New Roman" w:eastAsia="Times New Roman" w:hAnsi="Times New Roman" w:cs="Times New Roman"/>
-          <w:color w:val="EE0000"/>
-          <w:sz w:val="26"/>
-          <w:szCs w:val="26"/>
-          <w:highlight w:val="yellow"/>
-        </w:rPr>
-        <w:t>rải</w:t>
-      </w:r>
-      <w:proofErr w:type="spellEnd"/>
-      <w:r>
-        <w:rPr>
-          <w:rFonts w:ascii="Times New Roman" w:eastAsia="Times New Roman" w:hAnsi="Times New Roman" w:cs="Times New Roman"/>
-          <w:color w:val="EE0000"/>
-          <w:sz w:val="26"/>
-          <w:szCs w:val="26"/>
-          <w:highlight w:val="yellow"/>
-        </w:rPr>
-        <w:t xml:space="preserve"> </w:t>
-      </w:r>
-      <w:proofErr w:type="spellStart"/>
-      <w:r>
-        <w:rPr>
-          <w:rFonts w:ascii="Times New Roman" w:eastAsia="Times New Roman" w:hAnsi="Times New Roman" w:cs="Times New Roman"/>
-          <w:color w:val="EE0000"/>
-          <w:sz w:val="26"/>
-          <w:szCs w:val="26"/>
-          <w:highlight w:val="yellow"/>
-        </w:rPr>
-        <w:t>rác</w:t>
-      </w:r>
-      <w:proofErr w:type="spellEnd"/>
-      <w:r>
-        <w:rPr>
-          <w:rFonts w:ascii="Times New Roman" w:eastAsia="Times New Roman" w:hAnsi="Times New Roman" w:cs="Times New Roman"/>
-          <w:color w:val="EE0000"/>
-          <w:sz w:val="26"/>
-          <w:szCs w:val="26"/>
-          <w:highlight w:val="yellow"/>
-        </w:rPr>
-        <w:t xml:space="preserve"> </w:t>
-      </w:r>
-      <w:proofErr w:type="spellStart"/>
-      <w:r>
-        <w:rPr>
-          <w:rFonts w:ascii="Times New Roman" w:eastAsia="Times New Roman" w:hAnsi="Times New Roman" w:cs="Times New Roman"/>
-          <w:color w:val="EE0000"/>
-          <w:sz w:val="26"/>
-          <w:szCs w:val="26"/>
-          <w:highlight w:val="yellow"/>
-        </w:rPr>
-        <w:t>trên</w:t>
-      </w:r>
-      <w:proofErr w:type="spellEnd"/>
-      <w:r>
-        <w:rPr>
-          <w:rFonts w:ascii="Times New Roman" w:eastAsia="Times New Roman" w:hAnsi="Times New Roman" w:cs="Times New Roman"/>
-          <w:color w:val="EE0000"/>
-          <w:sz w:val="26"/>
-          <w:szCs w:val="26"/>
-          <w:highlight w:val="yellow"/>
-        </w:rPr>
-        <w:t xml:space="preserve"> </w:t>
-      </w:r>
-      <w:proofErr w:type="spellStart"/>
-      <w:r>
-        <w:rPr>
-          <w:rFonts w:ascii="Times New Roman" w:eastAsia="Times New Roman" w:hAnsi="Times New Roman" w:cs="Times New Roman"/>
-          <w:color w:val="EE0000"/>
-          <w:sz w:val="26"/>
-          <w:szCs w:val="26"/>
-          <w:highlight w:val="yellow"/>
-        </w:rPr>
-        <w:t>diện</w:t>
-      </w:r>
-      <w:proofErr w:type="spellEnd"/>
-      <w:r>
-        <w:rPr>
-          <w:rFonts w:ascii="Times New Roman" w:eastAsia="Times New Roman" w:hAnsi="Times New Roman" w:cs="Times New Roman"/>
-          <w:color w:val="EE0000"/>
-          <w:sz w:val="26"/>
-          <w:szCs w:val="26"/>
-          <w:highlight w:val="yellow"/>
-        </w:rPr>
-        <w:t xml:space="preserve"> </w:t>
-      </w:r>
-      <w:proofErr w:type="spellStart"/>
-      <w:r>
-        <w:rPr>
-          <w:rFonts w:ascii="Times New Roman" w:eastAsia="Times New Roman" w:hAnsi="Times New Roman" w:cs="Times New Roman"/>
-          <w:color w:val="EE0000"/>
-          <w:sz w:val="26"/>
-          <w:szCs w:val="26"/>
-          <w:highlight w:val="yellow"/>
-        </w:rPr>
-        <w:t>rộng</w:t>
-      </w:r>
-      <w:proofErr w:type="spellEnd"/>
-      <w:r>
-        <w:rPr>
-          <w:rFonts w:ascii="Times New Roman" w:eastAsia="Times New Roman" w:hAnsi="Times New Roman" w:cs="Times New Roman"/>
-          <w:color w:val="EE0000"/>
-          <w:sz w:val="26"/>
-          <w:szCs w:val="26"/>
-        </w:rPr>
-        <w:t xml:space="preserve"> </w:t>
-      </w:r>
-      <w:r>
-        <w:rPr>
-          <w:rFonts w:ascii="Times New Roman" w:eastAsia="Times New Roman" w:hAnsi="Times New Roman" w:cs="Times New Roman"/>
-          <w:sz w:val="26"/>
-          <w:szCs w:val="26"/>
-        </w:rPr>
-        <w:t>(</w:t>
-      </w:r>
-      <w:proofErr w:type="spellStart"/>
-      <w:r>
-        <w:rPr>
-          <w:rFonts w:ascii="Times New Roman" w:eastAsia="Times New Roman" w:hAnsi="Times New Roman" w:cs="Times New Roman"/>
-          <w:color w:val="EE0000"/>
-          <w:sz w:val="26"/>
-          <w:szCs w:val="26"/>
-        </w:rPr>
-        <w:t>nếu</w:t>
-      </w:r>
-      <w:proofErr w:type="spellEnd"/>
-      <w:r>
-        <w:rPr>
-          <w:rFonts w:ascii="Times New Roman" w:eastAsia="Times New Roman" w:hAnsi="Times New Roman" w:cs="Times New Roman"/>
-          <w:color w:val="EE0000"/>
-          <w:sz w:val="26"/>
-          <w:szCs w:val="26"/>
-        </w:rPr>
-        <w:t xml:space="preserve"> </w:t>
-      </w:r>
-      <w:proofErr w:type="spellStart"/>
-      <w:r>
-        <w:rPr>
-          <w:rFonts w:ascii="Times New Roman" w:eastAsia="Times New Roman" w:hAnsi="Times New Roman" w:cs="Times New Roman"/>
-          <w:color w:val="EE0000"/>
-          <w:sz w:val="26"/>
-          <w:szCs w:val="26"/>
-        </w:rPr>
-        <w:t>mưa</w:t>
-      </w:r>
-      <w:proofErr w:type="spellEnd"/>
-      <w:r>
-        <w:rPr>
-          <w:rFonts w:ascii="Times New Roman" w:eastAsia="Times New Roman" w:hAnsi="Times New Roman" w:cs="Times New Roman"/>
-          <w:color w:val="EE0000"/>
-          <w:sz w:val="26"/>
-          <w:szCs w:val="26"/>
-        </w:rPr>
-        <w:t xml:space="preserve"> </w:t>
-      </w:r>
-      <w:proofErr w:type="spellStart"/>
-      <w:r>
-        <w:rPr>
-          <w:rFonts w:ascii="Times New Roman" w:eastAsia="Times New Roman" w:hAnsi="Times New Roman" w:cs="Times New Roman"/>
-          <w:color w:val="EE0000"/>
-          <w:sz w:val="26"/>
-          <w:szCs w:val="26"/>
-        </w:rPr>
-        <w:t>trên</w:t>
-      </w:r>
-      <w:proofErr w:type="spellEnd"/>
-      <w:r>
-        <w:rPr>
-          <w:rFonts w:ascii="Times New Roman" w:eastAsia="Times New Roman" w:hAnsi="Times New Roman" w:cs="Times New Roman"/>
-          <w:color w:val="EE0000"/>
-          <w:sz w:val="26"/>
-          <w:szCs w:val="26"/>
-        </w:rPr>
-        <w:t xml:space="preserve"> </w:t>
-      </w:r>
-      <w:proofErr w:type="spellStart"/>
-      <w:r>
-        <w:rPr>
-          <w:rFonts w:ascii="Times New Roman" w:eastAsia="Times New Roman" w:hAnsi="Times New Roman" w:cs="Times New Roman"/>
-          <w:color w:val="EE0000"/>
-          <w:sz w:val="26"/>
-          <w:szCs w:val="26"/>
-        </w:rPr>
-        <w:t>nhiều</w:t>
-      </w:r>
-      <w:proofErr w:type="spellEnd"/>
-      <w:r>
-        <w:rPr>
-          <w:rFonts w:ascii="Times New Roman" w:eastAsia="Times New Roman" w:hAnsi="Times New Roman" w:cs="Times New Roman"/>
-          <w:color w:val="EE0000"/>
-          <w:sz w:val="26"/>
-          <w:szCs w:val="26"/>
-        </w:rPr>
-        <w:t xml:space="preserve"> </w:t>
-      </w:r>
-      <w:proofErr w:type="spellStart"/>
-      <w:r>
-        <w:rPr>
-          <w:rFonts w:ascii="Times New Roman" w:eastAsia="Times New Roman" w:hAnsi="Times New Roman" w:cs="Times New Roman"/>
-          <w:color w:val="EE0000"/>
-          <w:sz w:val="26"/>
-          <w:szCs w:val="26"/>
-        </w:rPr>
-        <w:t>điểm</w:t>
-      </w:r>
-      <w:proofErr w:type="spellEnd"/>
-      <w:r>
-        <w:rPr>
-          <w:rFonts w:ascii="Times New Roman" w:eastAsia="Times New Roman" w:hAnsi="Times New Roman" w:cs="Times New Roman"/>
-          <w:color w:val="EE0000"/>
-          <w:sz w:val="26"/>
-          <w:szCs w:val="26"/>
-        </w:rPr>
-        <w:t xml:space="preserve"> </w:t>
-      </w:r>
-      <w:proofErr w:type="spellStart"/>
-      <w:r>
-        <w:rPr>
-          <w:rFonts w:ascii="Times New Roman" w:eastAsia="Times New Roman" w:hAnsi="Times New Roman" w:cs="Times New Roman"/>
-          <w:color w:val="EE0000"/>
-          <w:sz w:val="26"/>
-          <w:szCs w:val="26"/>
-        </w:rPr>
-        <w:t>tại</w:t>
-      </w:r>
-      <w:proofErr w:type="spellEnd"/>
-      <w:r>
-        <w:rPr>
-          <w:rFonts w:ascii="Times New Roman" w:eastAsia="Times New Roman" w:hAnsi="Times New Roman" w:cs="Times New Roman"/>
-          <w:color w:val="EE0000"/>
-          <w:sz w:val="26"/>
-          <w:szCs w:val="26"/>
-        </w:rPr>
-        <w:t xml:space="preserve"> </w:t>
-      </w:r>
-      <w:proofErr w:type="spellStart"/>
-      <w:r>
-        <w:rPr>
-          <w:rFonts w:ascii="Times New Roman" w:eastAsia="Times New Roman" w:hAnsi="Times New Roman" w:cs="Times New Roman"/>
-          <w:color w:val="EE0000"/>
-          <w:sz w:val="26"/>
-          <w:szCs w:val="26"/>
-        </w:rPr>
-        <w:t>bảng</w:t>
-      </w:r>
-      <w:proofErr w:type="spellEnd"/>
-      <w:r>
-        <w:rPr>
-          <w:rFonts w:ascii="Times New Roman" w:eastAsia="Times New Roman" w:hAnsi="Times New Roman" w:cs="Times New Roman"/>
-          <w:color w:val="EE0000"/>
-          <w:sz w:val="26"/>
-          <w:szCs w:val="26"/>
-        </w:rPr>
-        <w:t xml:space="preserve"> </w:t>
-      </w:r>
-      <w:proofErr w:type="spellStart"/>
-      <w:r>
-        <w:rPr>
-          <w:rFonts w:ascii="Times New Roman" w:eastAsia="Times New Roman" w:hAnsi="Times New Roman" w:cs="Times New Roman"/>
-          <w:color w:val="EE0000"/>
-          <w:sz w:val="26"/>
-          <w:szCs w:val="26"/>
-        </w:rPr>
-        <w:t>thì</w:t>
-      </w:r>
-      <w:proofErr w:type="spellEnd"/>
-      <w:r>
-        <w:rPr>
-          <w:rFonts w:ascii="Times New Roman" w:eastAsia="Times New Roman" w:hAnsi="Times New Roman" w:cs="Times New Roman"/>
-          <w:color w:val="EE0000"/>
-          <w:sz w:val="26"/>
-          <w:szCs w:val="26"/>
-        </w:rPr>
-        <w:t xml:space="preserve"> </w:t>
-      </w:r>
-      <w:proofErr w:type="spellStart"/>
-      <w:r>
-        <w:rPr>
-          <w:rFonts w:ascii="Times New Roman" w:eastAsia="Times New Roman" w:hAnsi="Times New Roman" w:cs="Times New Roman"/>
-          <w:color w:val="EE0000"/>
-          <w:sz w:val="26"/>
-          <w:szCs w:val="26"/>
-        </w:rPr>
-        <w:t>nó</w:t>
-      </w:r>
-      <w:proofErr w:type="spellEnd"/>
-      <w:r>
-        <w:rPr>
-          <w:rFonts w:ascii="Times New Roman" w:eastAsia="Times New Roman" w:hAnsi="Times New Roman" w:cs="Times New Roman"/>
-          <w:color w:val="EE0000"/>
-          <w:sz w:val="26"/>
-          <w:szCs w:val="26"/>
-        </w:rPr>
-        <w:t xml:space="preserve"> </w:t>
-      </w:r>
-      <w:proofErr w:type="spellStart"/>
-      <w:r>
-        <w:rPr>
-          <w:rFonts w:ascii="Times New Roman" w:eastAsia="Times New Roman" w:hAnsi="Times New Roman" w:cs="Times New Roman"/>
-          <w:color w:val="EE0000"/>
-          <w:sz w:val="26"/>
-          <w:szCs w:val="26"/>
-        </w:rPr>
-        <w:t>sẽ</w:t>
-      </w:r>
-      <w:proofErr w:type="spellEnd"/>
-      <w:r>
-        <w:rPr>
-          <w:rFonts w:ascii="Times New Roman" w:eastAsia="Times New Roman" w:hAnsi="Times New Roman" w:cs="Times New Roman"/>
-          <w:color w:val="EE0000"/>
-          <w:sz w:val="26"/>
-          <w:szCs w:val="26"/>
-        </w:rPr>
-        <w:t xml:space="preserve"> </w:t>
-      </w:r>
-      <w:proofErr w:type="spellStart"/>
-      <w:r>
-        <w:rPr>
-          <w:rFonts w:ascii="Times New Roman" w:eastAsia="Times New Roman" w:hAnsi="Times New Roman" w:cs="Times New Roman"/>
-          <w:color w:val="EE0000"/>
-          <w:sz w:val="26"/>
-          <w:szCs w:val="26"/>
-        </w:rPr>
-        <w:t>tự</w:t>
-      </w:r>
-      <w:proofErr w:type="spellEnd"/>
-      <w:r>
-        <w:rPr>
-          <w:rFonts w:ascii="Times New Roman" w:eastAsia="Times New Roman" w:hAnsi="Times New Roman" w:cs="Times New Roman"/>
-          <w:color w:val="EE0000"/>
-          <w:sz w:val="26"/>
-          <w:szCs w:val="26"/>
-        </w:rPr>
-        <w:t xml:space="preserve"> </w:t>
-      </w:r>
-      <w:proofErr w:type="spellStart"/>
-      <w:r>
-        <w:rPr>
-          <w:rFonts w:ascii="Times New Roman" w:eastAsia="Times New Roman" w:hAnsi="Times New Roman" w:cs="Times New Roman"/>
-          <w:color w:val="EE0000"/>
-          <w:sz w:val="26"/>
-          <w:szCs w:val="26"/>
-        </w:rPr>
-        <w:t>động</w:t>
-      </w:r>
-      <w:proofErr w:type="spellEnd"/>
-      <w:r>
-        <w:rPr>
-          <w:rFonts w:ascii="Times New Roman" w:eastAsia="Times New Roman" w:hAnsi="Times New Roman" w:cs="Times New Roman"/>
-          <w:color w:val="EE0000"/>
-          <w:sz w:val="26"/>
-          <w:szCs w:val="26"/>
-        </w:rPr>
-        <w:t xml:space="preserve"> </w:t>
-      </w:r>
-      <w:proofErr w:type="spellStart"/>
-      <w:r>
-        <w:rPr>
-          <w:rFonts w:ascii="Times New Roman" w:eastAsia="Times New Roman" w:hAnsi="Times New Roman" w:cs="Times New Roman"/>
-          <w:color w:val="EE0000"/>
-          <w:sz w:val="26"/>
-          <w:szCs w:val="26"/>
-        </w:rPr>
-        <w:t>ghi</w:t>
-      </w:r>
-      <w:proofErr w:type="spellEnd"/>
-      <w:r>
-        <w:rPr>
-          <w:rFonts w:ascii="Times New Roman" w:eastAsia="Times New Roman" w:hAnsi="Times New Roman" w:cs="Times New Roman"/>
-          <w:color w:val="EE0000"/>
-          <w:sz w:val="26"/>
-          <w:szCs w:val="26"/>
-        </w:rPr>
-        <w:t xml:space="preserve"> </w:t>
-      </w:r>
-      <w:proofErr w:type="spellStart"/>
-      <w:r>
-        <w:rPr>
-          <w:rFonts w:ascii="Times New Roman" w:eastAsia="Times New Roman" w:hAnsi="Times New Roman" w:cs="Times New Roman"/>
-          <w:color w:val="EE0000"/>
-          <w:sz w:val="26"/>
-          <w:szCs w:val="26"/>
-        </w:rPr>
-        <w:t>là</w:t>
-      </w:r>
-      <w:proofErr w:type="spellEnd"/>
-      <w:r>
-        <w:rPr>
-          <w:rFonts w:ascii="Times New Roman" w:eastAsia="Times New Roman" w:hAnsi="Times New Roman" w:cs="Times New Roman"/>
-          <w:color w:val="EE0000"/>
-          <w:sz w:val="26"/>
-          <w:szCs w:val="26"/>
-        </w:rPr>
-        <w:t xml:space="preserve"> </w:t>
-      </w:r>
-      <w:proofErr w:type="spellStart"/>
-      <w:r>
-        <w:rPr>
-          <w:rFonts w:ascii="Times New Roman" w:eastAsia="Times New Roman" w:hAnsi="Times New Roman" w:cs="Times New Roman"/>
-          <w:color w:val="EE0000"/>
-          <w:sz w:val="26"/>
-          <w:szCs w:val="26"/>
-        </w:rPr>
-        <w:t>mưa</w:t>
-      </w:r>
-      <w:proofErr w:type="spellEnd"/>
-      <w:r>
-        <w:rPr>
-          <w:rFonts w:ascii="Times New Roman" w:eastAsia="Times New Roman" w:hAnsi="Times New Roman" w:cs="Times New Roman"/>
-          <w:color w:val="EE0000"/>
-          <w:sz w:val="26"/>
-          <w:szCs w:val="26"/>
-        </w:rPr>
-        <w:t xml:space="preserve"> </w:t>
-      </w:r>
-      <w:proofErr w:type="spellStart"/>
-      <w:r>
-        <w:rPr>
-          <w:rFonts w:ascii="Times New Roman" w:eastAsia="Times New Roman" w:hAnsi="Times New Roman" w:cs="Times New Roman"/>
-          <w:color w:val="EE0000"/>
-          <w:sz w:val="26"/>
-          <w:szCs w:val="26"/>
-        </w:rPr>
-        <w:t>rải</w:t>
-      </w:r>
-      <w:proofErr w:type="spellEnd"/>
-      <w:r>
-        <w:rPr>
-          <w:rFonts w:ascii="Times New Roman" w:eastAsia="Times New Roman" w:hAnsi="Times New Roman" w:cs="Times New Roman"/>
-          <w:color w:val="EE0000"/>
-          <w:sz w:val="26"/>
-          <w:szCs w:val="26"/>
-        </w:rPr>
-        <w:t xml:space="preserve"> </w:t>
-      </w:r>
-      <w:proofErr w:type="spellStart"/>
-      <w:r>
-        <w:rPr>
-          <w:rFonts w:ascii="Times New Roman" w:eastAsia="Times New Roman" w:hAnsi="Times New Roman" w:cs="Times New Roman"/>
-          <w:color w:val="EE0000"/>
-          <w:sz w:val="26"/>
-          <w:szCs w:val="26"/>
-        </w:rPr>
-        <w:t>rác</w:t>
-      </w:r>
-      <w:proofErr w:type="spellEnd"/>
-      <w:r>
-        <w:rPr>
-          <w:rFonts w:ascii="Times New Roman" w:eastAsia="Times New Roman" w:hAnsi="Times New Roman" w:cs="Times New Roman"/>
-          <w:color w:val="EE0000"/>
-          <w:sz w:val="26"/>
-          <w:szCs w:val="26"/>
-        </w:rPr>
-        <w:t xml:space="preserve"> </w:t>
-      </w:r>
-      <w:proofErr w:type="spellStart"/>
-      <w:r>
-        <w:rPr>
-          <w:rFonts w:ascii="Times New Roman" w:eastAsia="Times New Roman" w:hAnsi="Times New Roman" w:cs="Times New Roman"/>
-          <w:color w:val="EE0000"/>
-          <w:sz w:val="26"/>
-          <w:szCs w:val="26"/>
-        </w:rPr>
-        <w:t>diện</w:t>
-      </w:r>
-      <w:proofErr w:type="spellEnd"/>
-      <w:r>
-        <w:rPr>
-          <w:rFonts w:ascii="Times New Roman" w:eastAsia="Times New Roman" w:hAnsi="Times New Roman" w:cs="Times New Roman"/>
-          <w:color w:val="EE0000"/>
-          <w:sz w:val="26"/>
-          <w:szCs w:val="26"/>
-        </w:rPr>
-        <w:t xml:space="preserve"> </w:t>
-      </w:r>
-      <w:proofErr w:type="spellStart"/>
-      <w:r>
-        <w:rPr>
-          <w:rFonts w:ascii="Times New Roman" w:eastAsia="Times New Roman" w:hAnsi="Times New Roman" w:cs="Times New Roman"/>
-          <w:color w:val="EE0000"/>
-          <w:sz w:val="26"/>
-          <w:szCs w:val="26"/>
-        </w:rPr>
-        <w:t>rộng</w:t>
-      </w:r>
-      <w:proofErr w:type="spellEnd"/>
-      <w:r>
-        <w:rPr>
-          <w:rFonts w:ascii="Times New Roman" w:eastAsia="Times New Roman" w:hAnsi="Times New Roman" w:cs="Times New Roman"/>
-          <w:color w:val="EE0000"/>
-          <w:sz w:val="26"/>
-          <w:szCs w:val="26"/>
-        </w:rPr>
-        <w:t xml:space="preserve">, </w:t>
-      </w:r>
-      <w:proofErr w:type="spellStart"/>
-      <w:r>
-        <w:rPr>
-          <w:rFonts w:ascii="Times New Roman" w:eastAsia="Times New Roman" w:hAnsi="Times New Roman" w:cs="Times New Roman"/>
-          <w:color w:val="EE0000"/>
-          <w:sz w:val="26"/>
-          <w:szCs w:val="26"/>
-        </w:rPr>
-        <w:t>nếu</w:t>
-      </w:r>
-      <w:proofErr w:type="spellEnd"/>
-      <w:r>
-        <w:rPr>
-          <w:rFonts w:ascii="Times New Roman" w:eastAsia="Times New Roman" w:hAnsi="Times New Roman" w:cs="Times New Roman"/>
-          <w:color w:val="EE0000"/>
-          <w:sz w:val="26"/>
-          <w:szCs w:val="26"/>
-        </w:rPr>
-        <w:t xml:space="preserve"> </w:t>
-      </w:r>
-      <w:proofErr w:type="spellStart"/>
-      <w:r>
-        <w:rPr>
-          <w:rFonts w:ascii="Times New Roman" w:eastAsia="Times New Roman" w:hAnsi="Times New Roman" w:cs="Times New Roman"/>
-          <w:color w:val="EE0000"/>
-          <w:sz w:val="26"/>
-          <w:szCs w:val="26"/>
-        </w:rPr>
-        <w:t>ít</w:t>
-      </w:r>
-      <w:proofErr w:type="spellEnd"/>
-      <w:r>
-        <w:rPr>
-          <w:rFonts w:ascii="Times New Roman" w:eastAsia="Times New Roman" w:hAnsi="Times New Roman" w:cs="Times New Roman"/>
-          <w:color w:val="EE0000"/>
-          <w:sz w:val="26"/>
-          <w:szCs w:val="26"/>
-        </w:rPr>
-        <w:t xml:space="preserve"> </w:t>
-      </w:r>
-      <w:proofErr w:type="spellStart"/>
-      <w:r>
-        <w:rPr>
-          <w:rFonts w:ascii="Times New Roman" w:eastAsia="Times New Roman" w:hAnsi="Times New Roman" w:cs="Times New Roman"/>
-          <w:color w:val="EE0000"/>
-          <w:sz w:val="26"/>
-          <w:szCs w:val="26"/>
-        </w:rPr>
-        <w:t>thì</w:t>
-      </w:r>
-      <w:proofErr w:type="spellEnd"/>
-      <w:r>
-        <w:rPr>
-          <w:rFonts w:ascii="Times New Roman" w:eastAsia="Times New Roman" w:hAnsi="Times New Roman" w:cs="Times New Roman"/>
-          <w:color w:val="EE0000"/>
-          <w:sz w:val="26"/>
-          <w:szCs w:val="26"/>
-        </w:rPr>
-        <w:t xml:space="preserve"> </w:t>
-      </w:r>
-      <w:proofErr w:type="spellStart"/>
-      <w:r>
-        <w:rPr>
-          <w:rFonts w:ascii="Times New Roman" w:eastAsia="Times New Roman" w:hAnsi="Times New Roman" w:cs="Times New Roman"/>
-          <w:color w:val="EE0000"/>
-          <w:sz w:val="26"/>
-          <w:szCs w:val="26"/>
-        </w:rPr>
-        <w:t>nó</w:t>
-      </w:r>
-      <w:proofErr w:type="spellEnd"/>
-      <w:r>
-        <w:rPr>
-          <w:rFonts w:ascii="Times New Roman" w:eastAsia="Times New Roman" w:hAnsi="Times New Roman" w:cs="Times New Roman"/>
-          <w:color w:val="EE0000"/>
-          <w:sz w:val="26"/>
-          <w:szCs w:val="26"/>
-        </w:rPr>
-        <w:t xml:space="preserve"> </w:t>
-      </w:r>
-      <w:proofErr w:type="spellStart"/>
-      <w:r>
-        <w:rPr>
-          <w:rFonts w:ascii="Times New Roman" w:eastAsia="Times New Roman" w:hAnsi="Times New Roman" w:cs="Times New Roman"/>
-          <w:color w:val="EE0000"/>
-          <w:sz w:val="26"/>
-          <w:szCs w:val="26"/>
-        </w:rPr>
-        <w:t>ghi</w:t>
-      </w:r>
-      <w:proofErr w:type="spellEnd"/>
-      <w:r>
-        <w:rPr>
-          <w:rFonts w:ascii="Times New Roman" w:eastAsia="Times New Roman" w:hAnsi="Times New Roman" w:cs="Times New Roman"/>
-          <w:color w:val="EE0000"/>
-          <w:sz w:val="26"/>
-          <w:szCs w:val="26"/>
-        </w:rPr>
-        <w:t xml:space="preserve"> </w:t>
-      </w:r>
-      <w:proofErr w:type="spellStart"/>
-      <w:r>
-        <w:rPr>
-          <w:rFonts w:ascii="Times New Roman" w:eastAsia="Times New Roman" w:hAnsi="Times New Roman" w:cs="Times New Roman"/>
-          <w:color w:val="EE0000"/>
-          <w:sz w:val="26"/>
-          <w:szCs w:val="26"/>
-        </w:rPr>
-        <w:t>mưa</w:t>
-      </w:r>
-      <w:proofErr w:type="spellEnd"/>
-      <w:r>
-        <w:rPr>
-          <w:rFonts w:ascii="Times New Roman" w:eastAsia="Times New Roman" w:hAnsi="Times New Roman" w:cs="Times New Roman"/>
-          <w:color w:val="EE0000"/>
-          <w:sz w:val="26"/>
-          <w:szCs w:val="26"/>
-        </w:rPr>
-        <w:t xml:space="preserve"> </w:t>
-      </w:r>
-      <w:proofErr w:type="spellStart"/>
-      <w:r>
-        <w:rPr>
-          <w:rFonts w:ascii="Times New Roman" w:eastAsia="Times New Roman" w:hAnsi="Times New Roman" w:cs="Times New Roman"/>
-          <w:color w:val="EE0000"/>
-          <w:sz w:val="26"/>
-          <w:szCs w:val="26"/>
-        </w:rPr>
-        <w:t>vùng</w:t>
-      </w:r>
-      <w:proofErr w:type="spellEnd"/>
-      <w:r>
-        <w:rPr>
-          <w:rFonts w:ascii="Times New Roman" w:eastAsia="Times New Roman" w:hAnsi="Times New Roman" w:cs="Times New Roman"/>
-          <w:color w:val="EE0000"/>
-          <w:sz w:val="26"/>
-          <w:szCs w:val="26"/>
-        </w:rPr>
-        <w:t xml:space="preserve">….., </w:t>
-      </w:r>
-      <w:proofErr w:type="spellStart"/>
-      <w:r>
-        <w:rPr>
-          <w:rFonts w:ascii="Times New Roman" w:eastAsia="Times New Roman" w:hAnsi="Times New Roman" w:cs="Times New Roman"/>
-          <w:color w:val="EE0000"/>
-          <w:sz w:val="26"/>
-          <w:szCs w:val="26"/>
-        </w:rPr>
-        <w:t>tự</w:t>
-      </w:r>
-      <w:proofErr w:type="spellEnd"/>
-      <w:r>
-        <w:rPr>
-          <w:rFonts w:ascii="Times New Roman" w:eastAsia="Times New Roman" w:hAnsi="Times New Roman" w:cs="Times New Roman"/>
-          <w:color w:val="EE0000"/>
-          <w:sz w:val="26"/>
-          <w:szCs w:val="26"/>
-        </w:rPr>
-        <w:t xml:space="preserve"> </w:t>
-      </w:r>
-      <w:proofErr w:type="spellStart"/>
-      <w:r>
-        <w:rPr>
-          <w:rFonts w:ascii="Times New Roman" w:eastAsia="Times New Roman" w:hAnsi="Times New Roman" w:cs="Times New Roman"/>
-          <w:color w:val="EE0000"/>
-          <w:sz w:val="26"/>
-          <w:szCs w:val="26"/>
-        </w:rPr>
-        <w:t>nó</w:t>
-      </w:r>
-      <w:proofErr w:type="spellEnd"/>
-      <w:r>
-        <w:rPr>
-          <w:rFonts w:ascii="Times New Roman" w:eastAsia="Times New Roman" w:hAnsi="Times New Roman" w:cs="Times New Roman"/>
-          <w:color w:val="EE0000"/>
-          <w:sz w:val="26"/>
-          <w:szCs w:val="26"/>
-        </w:rPr>
-        <w:t xml:space="preserve"> </w:t>
-      </w:r>
-      <w:proofErr w:type="spellStart"/>
-      <w:r>
-        <w:rPr>
-          <w:rFonts w:ascii="Times New Roman" w:eastAsia="Times New Roman" w:hAnsi="Times New Roman" w:cs="Times New Roman"/>
-          <w:color w:val="EE0000"/>
-          <w:sz w:val="26"/>
-          <w:szCs w:val="26"/>
-        </w:rPr>
-        <w:t>phân</w:t>
-      </w:r>
-      <w:proofErr w:type="spellEnd"/>
-      <w:r>
-        <w:rPr>
-          <w:rFonts w:ascii="Times New Roman" w:eastAsia="Times New Roman" w:hAnsi="Times New Roman" w:cs="Times New Roman"/>
-          <w:color w:val="EE0000"/>
-          <w:sz w:val="26"/>
-          <w:szCs w:val="26"/>
-        </w:rPr>
-        <w:t xml:space="preserve"> </w:t>
-      </w:r>
-      <w:proofErr w:type="spellStart"/>
-      <w:r>
-        <w:rPr>
-          <w:rFonts w:ascii="Times New Roman" w:eastAsia="Times New Roman" w:hAnsi="Times New Roman" w:cs="Times New Roman"/>
-          <w:color w:val="EE0000"/>
-          <w:sz w:val="26"/>
-          <w:szCs w:val="26"/>
-        </w:rPr>
-        <w:t>bổ</w:t>
-      </w:r>
-      <w:proofErr w:type="spellEnd"/>
-      <w:r>
-        <w:rPr>
-          <w:rFonts w:ascii="Times New Roman" w:eastAsia="Times New Roman" w:hAnsi="Times New Roman" w:cs="Times New Roman"/>
-          <w:sz w:val="26"/>
-          <w:szCs w:val="26"/>
-        </w:rPr>
         <w:t>)</w:t>
-      </w:r>
-      <w:r>
-        <w:rPr>
-          <w:rFonts w:ascii="Times New Roman" w:eastAsia="Times New Roman" w:hAnsi="Times New Roman" w:cs="Times New Roman"/>
-          <w:sz w:val="26"/>
-          <w:szCs w:val="26"/>
-          <w:lang w:val="vi-VN"/>
-        </w:rPr>
-        <w:t>{mua_end}</w:t>
-      </w:r>
-      <w:r>
-        <w:rPr>
-          <w:rFonts w:ascii="Times New Roman" w:eastAsia="Times New Roman" w:hAnsi="Times New Roman" w:cs="Times New Roman"/>
-          <w:sz w:val="26"/>
-          <w:szCs w:val="26"/>
-        </w:rPr>
-        <w:t xml:space="preserve"> </w:t>
       </w:r>
       <w:r>
         <w:rPr>

</xml_diff>

<commit_message>
[mua] bao cao mua
</commit_message>
<xml_diff>
--- a/ai_tnhn/ai-api-tnhn/doc/Báo cáo mưa ngày {dd}-{mm}-{yyyy} thời điểm {hh}.docx
+++ b/ai_tnhn/ai-api-tnhn/doc/Báo cáo mưa ngày {dd}-{mm}-{yyyy} thời điểm {hh}.docx
@@ -2366,149 +2366,6 @@
           <w:szCs w:val="26"/>
         </w:rPr>
         <w:t>}</w:t>
-      </w:r>
-      <w:r>
-        <w:rPr>
-          <w:rFonts w:ascii="Times New Roman" w:hAnsi="Times New Roman" w:cs="Times New Roman"/>
-          <w:color w:val="000000" w:themeColor="text1"/>
-          <w:sz w:val="26"/>
-          <w:szCs w:val="26"/>
-        </w:rPr>
-        <w:t xml:space="preserve"> </w:t>
-      </w:r>
-      <w:r>
-        <w:rPr>
-          <w:rFonts w:ascii="Times New Roman" w:hAnsi="Times New Roman" w:cs="Times New Roman"/>
-          <w:sz w:val="26"/>
-          <w:szCs w:val="26"/>
-        </w:rPr>
-        <w:t>(</w:t>
-      </w:r>
-      <w:proofErr w:type="spellStart"/>
-      <w:r>
-        <w:rPr>
-          <w:rFonts w:ascii="Times New Roman" w:hAnsi="Times New Roman" w:cs="Times New Roman"/>
-          <w:sz w:val="26"/>
-          <w:szCs w:val="26"/>
-        </w:rPr>
-        <w:t>là</w:t>
-      </w:r>
-      <w:proofErr w:type="spellEnd"/>
-      <w:r>
-        <w:rPr>
-          <w:rFonts w:ascii="Times New Roman" w:hAnsi="Times New Roman" w:cs="Times New Roman"/>
-          <w:sz w:val="26"/>
-          <w:szCs w:val="26"/>
-        </w:rPr>
-        <w:t xml:space="preserve"> </w:t>
-      </w:r>
-      <w:proofErr w:type="spellStart"/>
-      <w:r>
-        <w:rPr>
-          <w:rFonts w:ascii="Times New Roman" w:hAnsi="Times New Roman" w:cs="Times New Roman"/>
-          <w:sz w:val="26"/>
-          <w:szCs w:val="26"/>
-        </w:rPr>
-        <w:t>thời</w:t>
-      </w:r>
-      <w:proofErr w:type="spellEnd"/>
-      <w:r>
-        <w:rPr>
-          <w:rFonts w:ascii="Times New Roman" w:hAnsi="Times New Roman" w:cs="Times New Roman"/>
-          <w:sz w:val="26"/>
-          <w:szCs w:val="26"/>
-        </w:rPr>
-        <w:t xml:space="preserve"> </w:t>
-      </w:r>
-      <w:proofErr w:type="spellStart"/>
-      <w:r>
-        <w:rPr>
-          <w:rFonts w:ascii="Times New Roman" w:hAnsi="Times New Roman" w:cs="Times New Roman"/>
-          <w:sz w:val="26"/>
-          <w:szCs w:val="26"/>
-        </w:rPr>
-        <w:t>điểm</w:t>
-      </w:r>
-      <w:proofErr w:type="spellEnd"/>
-      <w:r>
-        <w:rPr>
-          <w:rFonts w:ascii="Times New Roman" w:hAnsi="Times New Roman" w:cs="Times New Roman"/>
-          <w:sz w:val="26"/>
-          <w:szCs w:val="26"/>
-        </w:rPr>
-        <w:t xml:space="preserve"> </w:t>
-      </w:r>
-      <w:proofErr w:type="spellStart"/>
-      <w:r>
-        <w:rPr>
-          <w:rFonts w:ascii="Times New Roman" w:hAnsi="Times New Roman" w:cs="Times New Roman"/>
-          <w:sz w:val="26"/>
-          <w:szCs w:val="26"/>
-        </w:rPr>
-        <w:t>ấn</w:t>
-      </w:r>
-      <w:proofErr w:type="spellEnd"/>
-      <w:r>
-        <w:rPr>
-          <w:rFonts w:ascii="Times New Roman" w:hAnsi="Times New Roman" w:cs="Times New Roman"/>
-          <w:sz w:val="26"/>
-          <w:szCs w:val="26"/>
-        </w:rPr>
-        <w:t xml:space="preserve"> </w:t>
-      </w:r>
-      <w:proofErr w:type="spellStart"/>
-      <w:r>
-        <w:rPr>
-          <w:rFonts w:ascii="Times New Roman" w:hAnsi="Times New Roman" w:cs="Times New Roman"/>
-          <w:sz w:val="26"/>
-          <w:szCs w:val="26"/>
-        </w:rPr>
-        <w:t>lập</w:t>
-      </w:r>
-      <w:proofErr w:type="spellEnd"/>
-      <w:r>
-        <w:rPr>
-          <w:rFonts w:ascii="Times New Roman" w:hAnsi="Times New Roman" w:cs="Times New Roman"/>
-          <w:sz w:val="26"/>
-          <w:szCs w:val="26"/>
-        </w:rPr>
-        <w:t xml:space="preserve"> </w:t>
-      </w:r>
-      <w:proofErr w:type="spellStart"/>
-      <w:r>
-        <w:rPr>
-          <w:rFonts w:ascii="Times New Roman" w:hAnsi="Times New Roman" w:cs="Times New Roman"/>
-          <w:sz w:val="26"/>
-          <w:szCs w:val="26"/>
-        </w:rPr>
-        <w:t>báo</w:t>
-      </w:r>
-      <w:proofErr w:type="spellEnd"/>
-      <w:r>
-        <w:rPr>
-          <w:rFonts w:ascii="Times New Roman" w:hAnsi="Times New Roman" w:cs="Times New Roman"/>
-          <w:sz w:val="26"/>
-          <w:szCs w:val="26"/>
-        </w:rPr>
-        <w:t xml:space="preserve"> </w:t>
-      </w:r>
-      <w:proofErr w:type="spellStart"/>
-      <w:r>
-        <w:rPr>
-          <w:rFonts w:ascii="Times New Roman" w:hAnsi="Times New Roman" w:cs="Times New Roman"/>
-          <w:sz w:val="26"/>
-          <w:szCs w:val="26"/>
-        </w:rPr>
-        <w:t>cáo</w:t>
-      </w:r>
-      <w:proofErr w:type="spellEnd"/>
-      <w:r>
-        <w:rPr>
-          <w:rFonts w:ascii="Times New Roman" w:hAnsi="Times New Roman" w:cs="Times New Roman"/>
-          <w:sz w:val="26"/>
-          <w:szCs w:val="26"/>
-        </w:rPr>
-        <w:t>)</w:t>
       </w:r>
       <w:r>
         <w:rPr>

</xml_diff>